<commit_message>
Modulo de contratos en ordenes de compra y mejoras al menu
</commit_message>
<xml_diff>
--- a/docs/manual-compras/Manual_Usuario_AnitaERP_Modulo_Compras.docx
+++ b/docs/manual-compras/Manual_Usuario_AnitaERP_Modulo_Compras.docx
@@ -48,7 +48,7 @@
           <w:sz w:val="24"/>
           <w:szCs w:val="24"/>
         </w:rPr>
-        <w:t xml:space="preserve">Empresa: </w:t>
+        <w:t xml:space="preserve">Empresa: AGG</w:t>
       </w:r>
     </w:p>
     <w:p>
@@ -60,7 +60,7 @@
           <w:sz w:val="22"/>
           <w:szCs w:val="22"/>
         </w:rPr>
-        <w:t xml:space="preserve">Versión 1.2 — mayo 2026</w:t>
+        <w:t xml:space="preserve">Versión 1.4 — agosto 2026</w:t>
       </w:r>
     </w:p>
     <w:p/>
@@ -74,7 +74,7 @@
           <w:sz w:val="20"/>
           <w:szCs w:val="20"/>
         </w:rPr>
-        <w:t xml:space="preserve">URL: http://10.20.30.210/seguridad/login</w:t>
+        <w:t xml:space="preserve">URL: http://10.20.30.210/anitaERP/public/seguridad/login</w:t>
       </w:r>
     </w:p>
     <w:p>
@@ -199,7 +199,7 @@
           <w:sz w:val="22"/>
           <w:szCs w:val="22"/>
         </w:rPr>
-        <w:t xml:space="preserve">11. Circuito documental integrado</w:t>
+        <w:t xml:space="preserve">11. Contratos y OC abiertas</w:t>
       </w:r>
     </w:p>
     <w:p>
@@ -209,7 +209,7 @@
           <w:sz w:val="22"/>
           <w:szCs w:val="22"/>
         </w:rPr>
-        <w:t xml:space="preserve">12. Integración con sistema Anita</w:t>
+        <w:t xml:space="preserve">12. Avisos y seguimiento de contratos</w:t>
       </w:r>
     </w:p>
     <w:p>
@@ -219,7 +219,7 @@
           <w:sz w:val="22"/>
           <w:szCs w:val="22"/>
         </w:rPr>
-        <w:t xml:space="preserve">13. Resolución de problemas frecuentes</w:t>
+        <w:t xml:space="preserve">13. Circuito documental integrado</w:t>
       </w:r>
     </w:p>
     <w:p>
@@ -229,7 +229,27 @@
           <w:sz w:val="22"/>
           <w:szCs w:val="22"/>
         </w:rPr>
-        <w:t xml:space="preserve">14. Soporte</w:t>
+        <w:t xml:space="preserve">14. Integración con sistema Anita</w:t>
+      </w:r>
+    </w:p>
+    <w:p>
+      <w:pPr/>
+      <w:r>
+        <w:rPr>
+          <w:sz w:val="22"/>
+          <w:szCs w:val="22"/>
+        </w:rPr>
+        <w:t xml:space="preserve">15. Resolución de problemas frecuentes</w:t>
+      </w:r>
+    </w:p>
+    <w:p>
+      <w:pPr/>
+      <w:r>
+        <w:rPr>
+          <w:sz w:val="22"/>
+          <w:szCs w:val="22"/>
+        </w:rPr>
+        <w:t xml:space="preserve">16. Soporte</w:t>
       </w:r>
     </w:p>
     <w:p>
@@ -1249,6 +1269,76 @@
                 <w:sz w:val="20"/>
                 <w:szCs w:val="20"/>
               </w:rPr>
+              <w:t xml:space="preserve">seguimiento-aprobacion-requisicion</w:t>
+            </w:r>
+          </w:p>
+        </w:tc>
+        <w:tc>
+          <w:tcPr>
+            <w:tcW w:w="2800" w:type="dxa"/>
+            <w:noWrap/>
+          </w:tcPr>
+          <w:p>
+            <w:pPr/>
+            <w:r>
+              <w:rPr>
+                <w:sz w:val="20"/>
+                <w:szCs w:val="20"/>
+              </w:rPr>
+              <w:t xml:space="preserve">Tablero de seguimiento del circuito de aprobación</w:t>
+            </w:r>
+          </w:p>
+        </w:tc>
+      </w:tr>
+      <w:tr>
+        <w:trPr/>
+        <w:tc>
+          <w:tcPr>
+            <w:tcW w:w="2800" w:type="dxa"/>
+            <w:noWrap/>
+          </w:tcPr>
+          <w:p>
+            <w:pPr/>
+            <w:r>
+              <w:rPr>
+                <w:sz w:val="20"/>
+                <w:szCs w:val="20"/>
+              </w:rPr>
+              <w:t xml:space="preserve">listar-kpi-compras</w:t>
+            </w:r>
+          </w:p>
+        </w:tc>
+        <w:tc>
+          <w:tcPr>
+            <w:tcW w:w="2800" w:type="dxa"/>
+            <w:noWrap/>
+          </w:tcPr>
+          <w:p>
+            <w:pPr/>
+            <w:r>
+              <w:rPr>
+                <w:sz w:val="20"/>
+                <w:szCs w:val="20"/>
+              </w:rPr>
+              <w:t xml:space="preserve">Tablero KPIs de proceso y productividad (Enc-compras)</w:t>
+            </w:r>
+          </w:p>
+        </w:tc>
+      </w:tr>
+      <w:tr>
+        <w:trPr/>
+        <w:tc>
+          <w:tcPr>
+            <w:tcW w:w="2800" w:type="dxa"/>
+            <w:noWrap/>
+          </w:tcPr>
+          <w:p>
+            <w:pPr/>
+            <w:r>
+              <w:rPr>
+                <w:sz w:val="20"/>
+                <w:szCs w:val="20"/>
+              </w:rPr>
               <w:t xml:space="preserve">usuario-requisicion-compras</w:t>
             </w:r>
           </w:p>
@@ -2428,6 +2518,35 @@
     <w:p/>
     <w:p>
       <w:pPr>
+        <w:jc w:val="center"/>
+      </w:pPr>
+      <w:r>
+        <w:pict>
+          <v:shape type="#_x0000_t75" stroked="f" style="width:450pt; height:281.25pt; margin-left:0pt; margin-top:0pt; mso-position-horizontal:left; mso-position-vertical:top; mso-position-horizontal-relative:char; mso-position-vertical-relative:line;">
+            <w10:wrap type="inline"/>
+            <v:imagedata r:id="rId10" o:title=""/>
+          </v:shape>
+        </w:pict>
+      </w:r>
+    </w:p>
+    <w:p>
+      <w:pPr>
+        <w:jc w:val="center"/>
+      </w:pPr>
+      <w:r>
+        <w:rPr>
+          <w:color w:val="666666"/>
+          <w:sz w:val="18"/>
+          <w:szCs w:val="18"/>
+          <w:i w:val="1"/>
+          <w:iCs w:val="1"/>
+        </w:rPr>
+        <w:t xml:space="preserve">Ficha de edición de proveedor</w:t>
+      </w:r>
+    </w:p>
+    <w:p/>
+    <w:p>
+      <w:pPr>
         <w:jc w:val="both"/>
         <w:spacing w:after="120"/>
       </w:pPr>
@@ -4044,7 +4163,7 @@
         <w:pict>
           <v:shape type="#_x0000_t75" stroked="f" style="width:450pt; height:281.25pt; margin-left:0pt; margin-top:0pt; mso-position-horizontal:left; mso-position-vertical:top; mso-position-horizontal-relative:char; mso-position-vertical-relative:line;">
             <w10:wrap type="inline"/>
-            <v:imagedata r:id="rId10" o:title=""/>
+            <v:imagedata r:id="rId11" o:title=""/>
           </v:shape>
         </w:pict>
       </w:r>
@@ -4963,7 +5082,7 @@
         <w:pict>
           <v:shape type="#_x0000_t75" stroked="f" style="width:450pt; height:281.25pt; margin-left:0pt; margin-top:0pt; mso-position-horizontal:left; mso-position-vertical:top; mso-position-horizontal-relative:char; mso-position-vertical-relative:line;">
             <w10:wrap type="inline"/>
-            <v:imagedata r:id="rId11" o:title=""/>
+            <v:imagedata r:id="rId12" o:title=""/>
           </v:shape>
         </w:pict>
       </w:r>
@@ -4981,6 +5100,35 @@
           <w:iCs w:val="1"/>
         </w:rPr>
         <w:t xml:space="preserve">Listado de requisiciones</w:t>
+      </w:r>
+    </w:p>
+    <w:p/>
+    <w:p>
+      <w:pPr>
+        <w:jc w:val="center"/>
+      </w:pPr>
+      <w:r>
+        <w:pict>
+          <v:shape type="#_x0000_t75" stroked="f" style="width:450pt; height:281.25pt; margin-left:0pt; margin-top:0pt; mso-position-horizontal:left; mso-position-vertical:top; mso-position-horizontal-relative:char; mso-position-vertical-relative:line;">
+            <w10:wrap type="inline"/>
+            <v:imagedata r:id="rId13" o:title=""/>
+          </v:shape>
+        </w:pict>
+      </w:r>
+    </w:p>
+    <w:p>
+      <w:pPr>
+        <w:jc w:val="center"/>
+      </w:pPr>
+      <w:r>
+        <w:rPr>
+          <w:color w:val="666666"/>
+          <w:sz w:val="18"/>
+          <w:szCs w:val="18"/>
+          <w:i w:val="1"/>
+          <w:iCs w:val="1"/>
+        </w:rPr>
+        <w:t xml:space="preserve">Formulario de requisición</w:t>
       </w:r>
     </w:p>
     <w:p/>
@@ -5644,6 +5792,207 @@
                 <w:sz w:val="20"/>
                 <w:szCs w:val="20"/>
               </w:rPr>
+              <w:t xml:space="preserve">Seguimiento aprobación</w:t>
+            </w:r>
+          </w:p>
+        </w:tc>
+        <w:tc>
+          <w:tcPr>
+            <w:tcW w:w="2800" w:type="dxa"/>
+            <w:noWrap/>
+          </w:tcPr>
+          <w:p>
+            <w:pPr/>
+            <w:r>
+              <w:rPr>
+                <w:sz w:val="20"/>
+                <w:szCs w:val="20"/>
+              </w:rPr>
+              <w:t xml:space="preserve">Barra superior de la tarjeta (card-header) (botón amarillo)</w:t>
+            </w:r>
+          </w:p>
+        </w:tc>
+        <w:tc>
+          <w:tcPr>
+            <w:tcW w:w="2800" w:type="dxa"/>
+            <w:noWrap/>
+          </w:tcPr>
+          <w:p>
+            <w:pPr/>
+            <w:r>
+              <w:rPr>
+                <w:sz w:val="20"/>
+                <w:szCs w:val="20"/>
+              </w:rPr>
+              <w:t xml:space="preserve">Abre el tablero de requisiciones pendientes de aprobación: responsable actual, días desde creación y alerta si supera el plazo (48 hs por defecto). Incluye botón para ver el árbol sin abrir la requisición.</w:t>
+            </w:r>
+          </w:p>
+        </w:tc>
+        <w:tc>
+          <w:tcPr>
+            <w:tcW w:w="2800" w:type="dxa"/>
+            <w:noWrap/>
+          </w:tcPr>
+          <w:p>
+            <w:pPr/>
+            <w:r>
+              <w:rPr>
+                <w:sz w:val="20"/>
+                <w:szCs w:val="20"/>
+              </w:rPr>
+              <w:t xml:space="preserve">seguimiento-aprobacion-requisicion</w:t>
+            </w:r>
+          </w:p>
+        </w:tc>
+      </w:tr>
+      <w:tr>
+        <w:trPr/>
+        <w:tc>
+          <w:tcPr>
+            <w:tcW w:w="2800" w:type="dxa"/>
+            <w:noWrap/>
+          </w:tcPr>
+          <w:p>
+            <w:pPr/>
+            <w:r>
+              <w:rPr>
+                <w:sz w:val="20"/>
+                <w:szCs w:val="20"/>
+              </w:rPr>
+              <w:t xml:space="preserve">KPIs</w:t>
+            </w:r>
+          </w:p>
+        </w:tc>
+        <w:tc>
+          <w:tcPr>
+            <w:tcW w:w="2800" w:type="dxa"/>
+            <w:noWrap/>
+          </w:tcPr>
+          <w:p>
+            <w:pPr/>
+            <w:r>
+              <w:rPr>
+                <w:sz w:val="20"/>
+                <w:szCs w:val="20"/>
+              </w:rPr>
+              <w:t xml:space="preserve">Barra superior de la tarjeta (card-header) (botón verde)</w:t>
+            </w:r>
+          </w:p>
+        </w:tc>
+        <w:tc>
+          <w:tcPr>
+            <w:tcW w:w="2800" w:type="dxa"/>
+            <w:noWrap/>
+          </w:tcPr>
+          <w:p>
+            <w:pPr/>
+            <w:r>
+              <w:rPr>
+                <w:sz w:val="20"/>
+                <w:szCs w:val="20"/>
+              </w:rPr>
+              <w:t xml:space="preserve">Abre el tablero de KPIs de proceso (ciclo RQ→OC, gestión OC, circuito hasta COM, % OC abiertas) y productividad (OC y ahorro por comprador).</w:t>
+            </w:r>
+          </w:p>
+        </w:tc>
+        <w:tc>
+          <w:tcPr>
+            <w:tcW w:w="2800" w:type="dxa"/>
+            <w:noWrap/>
+          </w:tcPr>
+          <w:p>
+            <w:pPr/>
+            <w:r>
+              <w:rPr>
+                <w:sz w:val="20"/>
+                <w:szCs w:val="20"/>
+              </w:rPr>
+              <w:t xml:space="preserve">listar-kpi-compras</w:t>
+            </w:r>
+          </w:p>
+        </w:tc>
+      </w:tr>
+      <w:tr>
+        <w:trPr/>
+        <w:tc>
+          <w:tcPr>
+            <w:tcW w:w="2800" w:type="dxa"/>
+            <w:noWrap/>
+          </w:tcPr>
+          <w:p>
+            <w:pPr/>
+            <w:r>
+              <w:rPr>
+                <w:sz w:val="20"/>
+                <w:szCs w:val="20"/>
+              </w:rPr>
+              <w:t xml:space="preserve">Ver árbol de aprobación</w:t>
+            </w:r>
+          </w:p>
+        </w:tc>
+        <w:tc>
+          <w:tcPr>
+            <w:tcW w:w="2800" w:type="dxa"/>
+            <w:noWrap/>
+          </w:tcPr>
+          <w:p>
+            <w:pPr/>
+            <w:r>
+              <w:rPr>
+                <w:sz w:val="20"/>
+                <w:szCs w:val="20"/>
+              </w:rPr>
+              <w:t xml:space="preserve">Tablero seguimiento (ícono sitemap)</w:t>
+            </w:r>
+          </w:p>
+        </w:tc>
+        <w:tc>
+          <w:tcPr>
+            <w:tcW w:w="2800" w:type="dxa"/>
+            <w:noWrap/>
+          </w:tcPr>
+          <w:p>
+            <w:pPr/>
+            <w:r>
+              <w:rPr>
+                <w:sz w:val="20"/>
+                <w:szCs w:val="20"/>
+              </w:rPr>
+              <w:t xml:space="preserve">Modal con los movimientos del árbol (envío, nivel, estado, destinatario) sin entrar a editar la requisición.</w:t>
+            </w:r>
+          </w:p>
+        </w:tc>
+        <w:tc>
+          <w:tcPr>
+            <w:tcW w:w="2800" w:type="dxa"/>
+            <w:noWrap/>
+          </w:tcPr>
+          <w:p>
+            <w:pPr/>
+            <w:r>
+              <w:rPr>
+                <w:sz w:val="20"/>
+                <w:szCs w:val="20"/>
+              </w:rPr>
+              <w:t xml:space="preserve">seguimiento-aprobacion-requisicion</w:t>
+            </w:r>
+          </w:p>
+        </w:tc>
+      </w:tr>
+      <w:tr>
+        <w:trPr/>
+        <w:tc>
+          <w:tcPr>
+            <w:tcW w:w="2800" w:type="dxa"/>
+            <w:noWrap/>
+          </w:tcPr>
+          <w:p>
+            <w:pPr/>
+            <w:r>
+              <w:rPr>
+                <w:sz w:val="20"/>
+                <w:szCs w:val="20"/>
+              </w:rPr>
               <w:t xml:space="preserve">Editar</w:t>
             </w:r>
           </w:p>
@@ -6970,7 +7319,7 @@
         <w:pict>
           <v:shape type="#_x0000_t75" stroked="f" style="width:450pt; height:281.25pt; margin-left:0pt; margin-top:0pt; mso-position-horizontal:left; mso-position-vertical:top; mso-position-horizontal-relative:char; mso-position-vertical-relative:line;">
             <w10:wrap type="inline"/>
-            <v:imagedata r:id="rId12" o:title=""/>
+            <v:imagedata r:id="rId14" o:title=""/>
           </v:shape>
         </w:pict>
       </w:r>
@@ -6987,7 +7336,7 @@
           <w:i w:val="1"/>
           <w:iCs w:val="1"/>
         </w:rPr>
-        <w:t xml:space="preserve">Presupuestos en requisición</w:t>
+        <w:t xml:space="preserve">Solapa Presupuestos en requisición</w:t>
       </w:r>
     </w:p>
     <w:p/>
@@ -6999,7 +7348,7 @@
         <w:pict>
           <v:shape type="#_x0000_t75" stroked="f" style="width:450pt; height:281.25pt; margin-left:0pt; margin-top:0pt; mso-position-horizontal:left; mso-position-vertical:top; mso-position-horizontal-relative:char; mso-position-vertical-relative:line;">
             <w10:wrap type="inline"/>
-            <v:imagedata r:id="rId12" o:title=""/>
+            <v:imagedata r:id="rId14" o:title=""/>
           </v:shape>
         </w:pict>
       </w:r>
@@ -7016,7 +7365,7 @@
           <w:i w:val="1"/>
           <w:iCs w:val="1"/>
         </w:rPr>
-        <w:t xml:space="preserve">Presupuestos en requisición</w:t>
+        <w:t xml:space="preserve">Solapa Presupuestos en requisición</w:t>
       </w:r>
     </w:p>
     <w:p/>
@@ -7077,7 +7426,7 @@
         <w:pict>
           <v:shape type="#_x0000_t75" stroked="f" style="width:450pt; height:281.25pt; margin-left:0pt; margin-top:0pt; mso-position-horizontal:left; mso-position-vertical:top; mso-position-horizontal-relative:char; mso-position-vertical-relative:line;">
             <w10:wrap type="inline"/>
-            <v:imagedata r:id="rId13" o:title=""/>
+            <v:imagedata r:id="rId15" o:title=""/>
           </v:shape>
         </w:pict>
       </w:r>
@@ -7095,6 +7444,35 @@
           <w:iCs w:val="1"/>
         </w:rPr>
         <w:t xml:space="preserve">Listado de órdenes de compra</w:t>
+      </w:r>
+    </w:p>
+    <w:p/>
+    <w:p>
+      <w:pPr>
+        <w:jc w:val="center"/>
+      </w:pPr>
+      <w:r>
+        <w:pict>
+          <v:shape type="#_x0000_t75" stroked="f" style="width:450pt; height:281.25pt; margin-left:0pt; margin-top:0pt; mso-position-horizontal:left; mso-position-vertical:top; mso-position-horizontal-relative:char; mso-position-vertical-relative:line;">
+            <w10:wrap type="inline"/>
+            <v:imagedata r:id="rId16" o:title=""/>
+          </v:shape>
+        </w:pict>
+      </w:r>
+    </w:p>
+    <w:p>
+      <w:pPr>
+        <w:jc w:val="center"/>
+      </w:pPr>
+      <w:r>
+        <w:rPr>
+          <w:color w:val="666666"/>
+          <w:sz w:val="18"/>
+          <w:szCs w:val="18"/>
+          <w:i w:val="1"/>
+          <w:iCs w:val="1"/>
+        </w:rPr>
+        <w:t xml:space="preserve">Formulario de orden de compra</w:t>
       </w:r>
     </w:p>
     <w:p/>
@@ -7769,6 +8147,73 @@
                 <w:sz w:val="20"/>
                 <w:szCs w:val="20"/>
               </w:rPr>
+              <w:t xml:space="preserve">KPIs</w:t>
+            </w:r>
+          </w:p>
+        </w:tc>
+        <w:tc>
+          <w:tcPr>
+            <w:tcW w:w="2800" w:type="dxa"/>
+            <w:noWrap/>
+          </w:tcPr>
+          <w:p>
+            <w:pPr/>
+            <w:r>
+              <w:rPr>
+                <w:sz w:val="20"/>
+                <w:szCs w:val="20"/>
+              </w:rPr>
+              <w:t xml:space="preserve">Barra superior de la tarjeta (card-header) (botón verde)</w:t>
+            </w:r>
+          </w:p>
+        </w:tc>
+        <w:tc>
+          <w:tcPr>
+            <w:tcW w:w="2800" w:type="dxa"/>
+            <w:noWrap/>
+          </w:tcPr>
+          <w:p>
+            <w:pPr/>
+            <w:r>
+              <w:rPr>
+                <w:sz w:val="20"/>
+                <w:szCs w:val="20"/>
+              </w:rPr>
+              <w:t xml:space="preserve">Tablero de KPIs de proceso y productividad de Compras (metas de ciclo, gestión, % abiertas, OC/ahorro por comprador).</w:t>
+            </w:r>
+          </w:p>
+        </w:tc>
+        <w:tc>
+          <w:tcPr>
+            <w:tcW w:w="2800" w:type="dxa"/>
+            <w:noWrap/>
+          </w:tcPr>
+          <w:p>
+            <w:pPr/>
+            <w:r>
+              <w:rPr>
+                <w:sz w:val="20"/>
+                <w:szCs w:val="20"/>
+              </w:rPr>
+              <w:t xml:space="preserve">listar-kpi-compras</w:t>
+            </w:r>
+          </w:p>
+        </w:tc>
+      </w:tr>
+      <w:tr>
+        <w:trPr/>
+        <w:tc>
+          <w:tcPr>
+            <w:tcW w:w="2800" w:type="dxa"/>
+            <w:noWrap/>
+          </w:tcPr>
+          <w:p>
+            <w:pPr/>
+            <w:r>
+              <w:rPr>
+                <w:sz w:val="20"/>
+                <w:szCs w:val="20"/>
+              </w:rPr>
               <w:t xml:space="preserve">Editar</w:t>
             </w:r>
           </w:p>
@@ -9013,9 +9458,2014 @@
       </w:pPr>
       <w:bookmarkStart w:id="11" w:name="_Toc11"/>
       <w:r>
-        <w:t>11. Circuito documental integrado</w:t>
+        <w:t>11. Contratos y OC abiertas</w:t>
       </w:r>
       <w:bookmarkEnd w:id="11"/>
+    </w:p>
+    <w:p>
+      <w:pPr>
+        <w:jc w:val="both"/>
+        <w:spacing w:after="120"/>
+      </w:pPr>
+      <w:r>
+        <w:rPr>
+          <w:sz w:val="22"/>
+          <w:szCs w:val="22"/>
+        </w:rPr>
+        <w:t xml:space="preserve">Una OC abierta es la que no se agota con una entrega: abonos, honorarios profesionales, servicios recurrentes, mantenimientos, alquileres, licencias. En lugar de crear un documento distinto, la propia orden de compra se marca como contrato y se le cargan la vigencia, el monto contratado y el responsable. El ERP vigila esos datos y avisa antes del vencimiento, con el mismo criterio que los acuerdos marco de SAP o los purchase agreements de Oracle.</w:t>
+      </w:r>
+    </w:p>
+    <w:p>
+      <w:pPr>
+        <w:jc w:val="both"/>
+        <w:spacing w:after="120"/>
+      </w:pPr>
+      <w:r>
+        <w:rPr>
+          <w:sz w:val="22"/>
+          <w:szCs w:val="22"/>
+        </w:rPr>
+        <w:t xml:space="preserve">Se marca en el formulario de la orden de compra (compras/ordencompra/crear o editar) tildando la casilla "Contrato / OC abierta" en el bloque del mismo nombre. Recién al tildarla se despliegan los campos de vigencia, tope y avisos; una OC común no muestra nada de esto.</w:t>
+      </w:r>
+    </w:p>
+    <w:p>
+      <w:pPr>
+        <w:jc w:val="both"/>
+        <w:spacing w:after="120"/>
+      </w:pPr>
+      <w:r>
+        <w:rPr>
+          <w:sz w:val="22"/>
+          <w:szCs w:val="22"/>
+        </w:rPr>
+        <w:t xml:space="preserve">Cargar la vigencia es lo mínimo indispensable: sin fecha de fin no hay aviso de vencimiento posible. El monto contratado es opcional, pero es lo que habilita el control de consumo.</w:t>
+      </w:r>
+    </w:p>
+    <w:p>
+      <w:pPr>
+        <w:numPr>
+          <w:ilvl w:val="0"/>
+          <w:numId w:val=""/>
+        </w:numPr>
+      </w:pPr>
+      <w:r>
+        <w:rPr/>
+        <w:t xml:space="preserve">Vigencia desde / hasta: período del contrato. La fecha "hasta" es la que dispara los avisos de vencimiento.</w:t>
+      </w:r>
+    </w:p>
+    <w:p>
+      <w:pPr>
+        <w:numPr>
+          <w:ilvl w:val="0"/>
+          <w:numId w:val=""/>
+        </w:numPr>
+      </w:pPr>
+      <w:r>
+        <w:rPr/>
+        <w:t xml:space="preserve">Monto contratado (tope): importe máximo que puede consumir el contrato. Vacío significa sin tope, y en ese caso no hay avisos por consumo.</w:t>
+      </w:r>
+    </w:p>
+    <w:p>
+      <w:pPr>
+        <w:numPr>
+          <w:ilvl w:val="0"/>
+          <w:numId w:val=""/>
+        </w:numPr>
+      </w:pPr>
+      <w:r>
+        <w:rPr/>
+        <w:t xml:space="preserve">Moneda del tope: si se elige una moneda, solo se computan las recepciones y facturas de esa misma moneda. Con "Moneda local" se computa el equivalente convertido por cotización.</w:t>
+      </w:r>
+    </w:p>
+    <w:p>
+      <w:pPr>
+        <w:numPr>
+          <w:ilvl w:val="0"/>
+          <w:numId w:val=""/>
+        </w:numPr>
+      </w:pPr>
+      <w:r>
+        <w:rPr/>
+        <w:t xml:space="preserve">Se renueva automáticamente + Días de preaviso para no renovar: si el contrato se renueva solo, lo accionable no es el fin de vigencia sino la fecha límite para notificar que NO se renueva (fin de vigencia menos los días de preaviso). Pasada esa fecha el contrato se renueva por otro período.</w:t>
+      </w:r>
+    </w:p>
+    <w:p>
+      <w:pPr>
+        <w:numPr>
+          <w:ilvl w:val="0"/>
+          <w:numId w:val=""/>
+        </w:numPr>
+      </w:pPr>
+      <w:r>
+        <w:rPr/>
+        <w:t xml:space="preserve">Días de aviso: umbrales propios de este contrato, separados por coma (por ejemplo 90,45). Vacío usa el default del sistema (60,30,15). Cada umbral avisa una sola vez.</w:t>
+      </w:r>
+    </w:p>
+    <w:p>
+      <w:pPr>
+        <w:numPr>
+          <w:ilvl w:val="0"/>
+          <w:numId w:val=""/>
+        </w:numPr>
+      </w:pPr>
+      <w:r>
+        <w:rPr/>
+        <w:t xml:space="preserve">Responsable: usuario dueño del contrato. Recibe siempre los avisos de sus contratos, además de los destinatarios generales configurados.</w:t>
+      </w:r>
+    </w:p>
+    <w:p>
+      <w:pPr>
+        <w:numPr>
+          <w:ilvl w:val="0"/>
+          <w:numId w:val=""/>
+        </w:numPr>
+      </w:pPr>
+      <w:r>
+        <w:rPr/>
+        <w:t xml:space="preserve">Estado actual: debajo del bloque, la OC muestra el consumo acumulado, el porcentaje del tope, el vencimiento y de dónde salió el consumo (recepción, factura o ambos).</w:t>
+      </w:r>
+    </w:p>
+    <w:p/>
+    <w:p>
+      <w:pPr/>
+      <w:r>
+        <w:rPr>
+          <w:color w:val="2E75B6"/>
+          <w:sz w:val="22"/>
+          <w:szCs w:val="22"/>
+          <w:b w:val="1"/>
+          <w:bCs w:val="1"/>
+        </w:rPr>
+        <w:t xml:space="preserve">Bloque Contrato / OC abierta en la orden de compra</w:t>
+      </w:r>
+    </w:p>
+    <w:tbl>
+      <w:tblGrid>
+        <w:gridCol w:w="2800" w:type="dxa"/>
+        <w:gridCol w:w="2800" w:type="dxa"/>
+        <w:gridCol w:w="2800" w:type="dxa"/>
+        <w:gridCol w:w="2800" w:type="dxa"/>
+      </w:tblGrid>
+      <w:tblPr>
+        <w:tblW w:w="0" w:type="auto"/>
+        <w:tblLayout w:type="autofit"/>
+        <w:tblCellMar>
+          <w:top w:w="80" w:type="dxa"/>
+          <w:left w:w="80" w:type="dxa"/>
+          <w:right w:w="80" w:type="dxa"/>
+          <w:bottom w:w="80" w:type="dxa"/>
+        </w:tblCellMar>
+        <w:tblBorders>
+          <w:top w:val="single" w:sz="6" w:color="AAAAAA"/>
+          <w:left w:val="single" w:sz="6" w:color="AAAAAA"/>
+          <w:right w:val="single" w:sz="6" w:color="AAAAAA"/>
+          <w:bottom w:val="single" w:sz="6" w:color="AAAAAA"/>
+          <w:insideH w:val="single" w:sz="6" w:color="AAAAAA"/>
+          <w:insideV w:val="single" w:sz="6" w:color="AAAAAA"/>
+        </w:tblBorders>
+      </w:tblPr>
+      <w:tr>
+        <w:trPr/>
+        <w:tc>
+          <w:tcPr>
+            <w:tcW w:w="2800" w:type="dxa"/>
+            <w:shd w:val="clear" w:fill="2E75B6"/>
+            <w:noWrap/>
+          </w:tcPr>
+          <w:p>
+            <w:pPr/>
+            <w:r>
+              <w:rPr>
+                <w:color w:val="FFFFFF"/>
+                <w:sz w:val="20"/>
+                <w:szCs w:val="20"/>
+                <w:b w:val="1"/>
+                <w:bCs w:val="1"/>
+              </w:rPr>
+              <w:t xml:space="preserve">Herramienta</w:t>
+            </w:r>
+          </w:p>
+        </w:tc>
+        <w:tc>
+          <w:tcPr>
+            <w:tcW w:w="2800" w:type="dxa"/>
+            <w:shd w:val="clear" w:fill="2E75B6"/>
+            <w:noWrap/>
+          </w:tcPr>
+          <w:p>
+            <w:pPr/>
+            <w:r>
+              <w:rPr>
+                <w:color w:val="FFFFFF"/>
+                <w:sz w:val="20"/>
+                <w:szCs w:val="20"/>
+                <w:b w:val="1"/>
+                <w:bCs w:val="1"/>
+              </w:rPr>
+              <w:t xml:space="preserve">Ubicación</w:t>
+            </w:r>
+          </w:p>
+        </w:tc>
+        <w:tc>
+          <w:tcPr>
+            <w:tcW w:w="2800" w:type="dxa"/>
+            <w:shd w:val="clear" w:fill="2E75B6"/>
+            <w:noWrap/>
+          </w:tcPr>
+          <w:p>
+            <w:pPr/>
+            <w:r>
+              <w:rPr>
+                <w:color w:val="FFFFFF"/>
+                <w:sz w:val="20"/>
+                <w:szCs w:val="20"/>
+                <w:b w:val="1"/>
+                <w:bCs w:val="1"/>
+              </w:rPr>
+              <w:t xml:space="preserve">Qué hace</w:t>
+            </w:r>
+          </w:p>
+        </w:tc>
+        <w:tc>
+          <w:tcPr>
+            <w:tcW w:w="2800" w:type="dxa"/>
+            <w:shd w:val="clear" w:fill="2E75B6"/>
+            <w:noWrap/>
+          </w:tcPr>
+          <w:p>
+            <w:pPr/>
+            <w:r>
+              <w:rPr>
+                <w:color w:val="FFFFFF"/>
+                <w:sz w:val="20"/>
+                <w:szCs w:val="20"/>
+                <w:b w:val="1"/>
+                <w:bCs w:val="1"/>
+              </w:rPr>
+              <w:t xml:space="preserve">Permiso</w:t>
+            </w:r>
+          </w:p>
+        </w:tc>
+      </w:tr>
+      <w:tr>
+        <w:trPr/>
+        <w:tc>
+          <w:tcPr>
+            <w:tcW w:w="2800" w:type="dxa"/>
+            <w:noWrap/>
+          </w:tcPr>
+          <w:p>
+            <w:pPr/>
+            <w:r>
+              <w:rPr>
+                <w:sz w:val="20"/>
+                <w:szCs w:val="20"/>
+              </w:rPr>
+              <w:t xml:space="preserve">Contrato / OC abierta</w:t>
+            </w:r>
+          </w:p>
+        </w:tc>
+        <w:tc>
+          <w:tcPr>
+            <w:tcW w:w="2800" w:type="dxa"/>
+            <w:noWrap/>
+          </w:tcPr>
+          <w:p>
+            <w:pPr/>
+            <w:r>
+              <w:rPr>
+                <w:sz w:val="20"/>
+                <w:szCs w:val="20"/>
+              </w:rPr>
+              <w:t xml:space="preserve">Cabecera del bloque Contrato (casilla)</w:t>
+            </w:r>
+          </w:p>
+        </w:tc>
+        <w:tc>
+          <w:tcPr>
+            <w:tcW w:w="2800" w:type="dxa"/>
+            <w:noWrap/>
+          </w:tcPr>
+          <w:p>
+            <w:pPr/>
+            <w:r>
+              <w:rPr>
+                <w:sz w:val="20"/>
+                <w:szCs w:val="20"/>
+              </w:rPr>
+              <w:t xml:space="preserve">Marca la OC como contrato y despliega los campos de vigencia, tope y avisos.</w:t>
+            </w:r>
+          </w:p>
+        </w:tc>
+        <w:tc>
+          <w:tcPr>
+            <w:tcW w:w="2800" w:type="dxa"/>
+            <w:noWrap/>
+          </w:tcPr>
+          <w:p>
+            <w:pPr/>
+            <w:r>
+              <w:rPr>
+                <w:sz w:val="20"/>
+                <w:szCs w:val="20"/>
+              </w:rPr>
+              <w:t xml:space="preserve">crear-ordencompra / editar-ordencompra</w:t>
+            </w:r>
+          </w:p>
+        </w:tc>
+      </w:tr>
+      <w:tr>
+        <w:trPr/>
+        <w:tc>
+          <w:tcPr>
+            <w:tcW w:w="2800" w:type="dxa"/>
+            <w:noWrap/>
+          </w:tcPr>
+          <w:p>
+            <w:pPr/>
+            <w:r>
+              <w:rPr>
+                <w:sz w:val="20"/>
+                <w:szCs w:val="20"/>
+              </w:rPr>
+              <w:t xml:space="preserve">Vigencia desde / hasta</w:t>
+            </w:r>
+          </w:p>
+        </w:tc>
+        <w:tc>
+          <w:tcPr>
+            <w:tcW w:w="2800" w:type="dxa"/>
+            <w:noWrap/>
+          </w:tcPr>
+          <w:p>
+            <w:pPr/>
+            <w:r>
+              <w:rPr>
+                <w:sz w:val="20"/>
+                <w:szCs w:val="20"/>
+              </w:rPr>
+              <w:t xml:space="preserve">Bloque Contrato</w:t>
+            </w:r>
+          </w:p>
+        </w:tc>
+        <w:tc>
+          <w:tcPr>
+            <w:tcW w:w="2800" w:type="dxa"/>
+            <w:noWrap/>
+          </w:tcPr>
+          <w:p>
+            <w:pPr/>
+            <w:r>
+              <w:rPr>
+                <w:sz w:val="20"/>
+                <w:szCs w:val="20"/>
+              </w:rPr>
+              <w:t xml:space="preserve">Período del contrato. La fecha hasta dispara los avisos de vencimiento.</w:t>
+            </w:r>
+          </w:p>
+        </w:tc>
+        <w:tc>
+          <w:tcPr>
+            <w:tcW w:w="2800" w:type="dxa"/>
+            <w:noWrap/>
+          </w:tcPr>
+          <w:p>
+            <w:pPr/>
+            <w:r>
+              <w:rPr>
+                <w:sz w:val="20"/>
+                <w:szCs w:val="20"/>
+              </w:rPr>
+              <w:t xml:space="preserve">crear-ordencompra / editar-ordencompra</w:t>
+            </w:r>
+          </w:p>
+        </w:tc>
+      </w:tr>
+      <w:tr>
+        <w:trPr/>
+        <w:tc>
+          <w:tcPr>
+            <w:tcW w:w="2800" w:type="dxa"/>
+            <w:noWrap/>
+          </w:tcPr>
+          <w:p>
+            <w:pPr/>
+            <w:r>
+              <w:rPr>
+                <w:sz w:val="20"/>
+                <w:szCs w:val="20"/>
+              </w:rPr>
+              <w:t xml:space="preserve">Monto contratado + Moneda del tope</w:t>
+            </w:r>
+          </w:p>
+        </w:tc>
+        <w:tc>
+          <w:tcPr>
+            <w:tcW w:w="2800" w:type="dxa"/>
+            <w:noWrap/>
+          </w:tcPr>
+          <w:p>
+            <w:pPr/>
+            <w:r>
+              <w:rPr>
+                <w:sz w:val="20"/>
+                <w:szCs w:val="20"/>
+              </w:rPr>
+              <w:t xml:space="preserve">Bloque Contrato</w:t>
+            </w:r>
+          </w:p>
+        </w:tc>
+        <w:tc>
+          <w:tcPr>
+            <w:tcW w:w="2800" w:type="dxa"/>
+            <w:noWrap/>
+          </w:tcPr>
+          <w:p>
+            <w:pPr/>
+            <w:r>
+              <w:rPr>
+                <w:sz w:val="20"/>
+                <w:szCs w:val="20"/>
+              </w:rPr>
+              <w:t xml:space="preserve">Tope de consumo y moneda en que se controla. Vacío = sin tope.</w:t>
+            </w:r>
+          </w:p>
+        </w:tc>
+        <w:tc>
+          <w:tcPr>
+            <w:tcW w:w="2800" w:type="dxa"/>
+            <w:noWrap/>
+          </w:tcPr>
+          <w:p>
+            <w:pPr/>
+            <w:r>
+              <w:rPr>
+                <w:sz w:val="20"/>
+                <w:szCs w:val="20"/>
+              </w:rPr>
+              <w:t xml:space="preserve">crear-ordencompra / editar-ordencompra</w:t>
+            </w:r>
+          </w:p>
+        </w:tc>
+      </w:tr>
+      <w:tr>
+        <w:trPr/>
+        <w:tc>
+          <w:tcPr>
+            <w:tcW w:w="2800" w:type="dxa"/>
+            <w:noWrap/>
+          </w:tcPr>
+          <w:p>
+            <w:pPr/>
+            <w:r>
+              <w:rPr>
+                <w:sz w:val="20"/>
+                <w:szCs w:val="20"/>
+              </w:rPr>
+              <w:t xml:space="preserve">Se renueva automáticamente + Días de preaviso</w:t>
+            </w:r>
+          </w:p>
+        </w:tc>
+        <w:tc>
+          <w:tcPr>
+            <w:tcW w:w="2800" w:type="dxa"/>
+            <w:noWrap/>
+          </w:tcPr>
+          <w:p>
+            <w:pPr/>
+            <w:r>
+              <w:rPr>
+                <w:sz w:val="20"/>
+                <w:szCs w:val="20"/>
+              </w:rPr>
+              <w:t xml:space="preserve">Bloque Contrato</w:t>
+            </w:r>
+          </w:p>
+        </w:tc>
+        <w:tc>
+          <w:tcPr>
+            <w:tcW w:w="2800" w:type="dxa"/>
+            <w:noWrap/>
+          </w:tcPr>
+          <w:p>
+            <w:pPr/>
+            <w:r>
+              <w:rPr>
+                <w:sz w:val="20"/>
+                <w:szCs w:val="20"/>
+              </w:rPr>
+              <w:t xml:space="preserve">Calcula la fecha límite para notificar la no renovación (fin de vigencia menos los días indicados).</w:t>
+            </w:r>
+          </w:p>
+        </w:tc>
+        <w:tc>
+          <w:tcPr>
+            <w:tcW w:w="2800" w:type="dxa"/>
+            <w:noWrap/>
+          </w:tcPr>
+          <w:p>
+            <w:pPr/>
+            <w:r>
+              <w:rPr>
+                <w:sz w:val="20"/>
+                <w:szCs w:val="20"/>
+              </w:rPr>
+              <w:t xml:space="preserve">crear-ordencompra / editar-ordencompra</w:t>
+            </w:r>
+          </w:p>
+        </w:tc>
+      </w:tr>
+      <w:tr>
+        <w:trPr/>
+        <w:tc>
+          <w:tcPr>
+            <w:tcW w:w="2800" w:type="dxa"/>
+            <w:noWrap/>
+          </w:tcPr>
+          <w:p>
+            <w:pPr/>
+            <w:r>
+              <w:rPr>
+                <w:sz w:val="20"/>
+                <w:szCs w:val="20"/>
+              </w:rPr>
+              <w:t xml:space="preserve">Días de aviso</w:t>
+            </w:r>
+          </w:p>
+        </w:tc>
+        <w:tc>
+          <w:tcPr>
+            <w:tcW w:w="2800" w:type="dxa"/>
+            <w:noWrap/>
+          </w:tcPr>
+          <w:p>
+            <w:pPr/>
+            <w:r>
+              <w:rPr>
+                <w:sz w:val="20"/>
+                <w:szCs w:val="20"/>
+              </w:rPr>
+              <w:t xml:space="preserve">Bloque Contrato</w:t>
+            </w:r>
+          </w:p>
+        </w:tc>
+        <w:tc>
+          <w:tcPr>
+            <w:tcW w:w="2800" w:type="dxa"/>
+            <w:noWrap/>
+          </w:tcPr>
+          <w:p>
+            <w:pPr/>
+            <w:r>
+              <w:rPr>
+                <w:sz w:val="20"/>
+                <w:szCs w:val="20"/>
+              </w:rPr>
+              <w:t xml:space="preserve">Umbrales propios del contrato separados por coma. Vacío usa el default del sistema.</w:t>
+            </w:r>
+          </w:p>
+        </w:tc>
+        <w:tc>
+          <w:tcPr>
+            <w:tcW w:w="2800" w:type="dxa"/>
+            <w:noWrap/>
+          </w:tcPr>
+          <w:p>
+            <w:pPr/>
+            <w:r>
+              <w:rPr>
+                <w:sz w:val="20"/>
+                <w:szCs w:val="20"/>
+              </w:rPr>
+              <w:t xml:space="preserve">crear-ordencompra / editar-ordencompra</w:t>
+            </w:r>
+          </w:p>
+        </w:tc>
+      </w:tr>
+      <w:tr>
+        <w:trPr/>
+        <w:tc>
+          <w:tcPr>
+            <w:tcW w:w="2800" w:type="dxa"/>
+            <w:noWrap/>
+          </w:tcPr>
+          <w:p>
+            <w:pPr/>
+            <w:r>
+              <w:rPr>
+                <w:sz w:val="20"/>
+                <w:szCs w:val="20"/>
+              </w:rPr>
+              <w:t xml:space="preserve">Responsable</w:t>
+            </w:r>
+          </w:p>
+        </w:tc>
+        <w:tc>
+          <w:tcPr>
+            <w:tcW w:w="2800" w:type="dxa"/>
+            <w:noWrap/>
+          </w:tcPr>
+          <w:p>
+            <w:pPr/>
+            <w:r>
+              <w:rPr>
+                <w:sz w:val="20"/>
+                <w:szCs w:val="20"/>
+              </w:rPr>
+              <w:t xml:space="preserve">Bloque Contrato</w:t>
+            </w:r>
+          </w:p>
+        </w:tc>
+        <w:tc>
+          <w:tcPr>
+            <w:tcW w:w="2800" w:type="dxa"/>
+            <w:noWrap/>
+          </w:tcPr>
+          <w:p>
+            <w:pPr/>
+            <w:r>
+              <w:rPr>
+                <w:sz w:val="20"/>
+                <w:szCs w:val="20"/>
+              </w:rPr>
+              <w:t xml:space="preserve">Usuario dueño del contrato; recibe siempre los avisos de sus contratos.</w:t>
+            </w:r>
+          </w:p>
+        </w:tc>
+        <w:tc>
+          <w:tcPr>
+            <w:tcW w:w="2800" w:type="dxa"/>
+            <w:noWrap/>
+          </w:tcPr>
+          <w:p>
+            <w:pPr/>
+            <w:r>
+              <w:rPr>
+                <w:sz w:val="20"/>
+                <w:szCs w:val="20"/>
+              </w:rPr>
+              <w:t xml:space="preserve">crear-ordencompra / editar-ordencompra</w:t>
+            </w:r>
+          </w:p>
+        </w:tc>
+      </w:tr>
+      <w:tr>
+        <w:trPr/>
+        <w:tc>
+          <w:tcPr>
+            <w:tcW w:w="2800" w:type="dxa"/>
+            <w:noWrap/>
+          </w:tcPr>
+          <w:p>
+            <w:pPr/>
+            <w:r>
+              <w:rPr>
+                <w:sz w:val="20"/>
+                <w:szCs w:val="20"/>
+              </w:rPr>
+              <w:t xml:space="preserve">Estado actual</w:t>
+            </w:r>
+          </w:p>
+        </w:tc>
+        <w:tc>
+          <w:tcPr>
+            <w:tcW w:w="2800" w:type="dxa"/>
+            <w:noWrap/>
+          </w:tcPr>
+          <w:p>
+            <w:pPr/>
+            <w:r>
+              <w:rPr>
+                <w:sz w:val="20"/>
+                <w:szCs w:val="20"/>
+              </w:rPr>
+              <w:t xml:space="preserve">Pie del bloque Contrato</w:t>
+            </w:r>
+          </w:p>
+        </w:tc>
+        <w:tc>
+          <w:tcPr>
+            <w:tcW w:w="2800" w:type="dxa"/>
+            <w:noWrap/>
+          </w:tcPr>
+          <w:p>
+            <w:pPr/>
+            <w:r>
+              <w:rPr>
+                <w:sz w:val="20"/>
+                <w:szCs w:val="20"/>
+              </w:rPr>
+              <w:t xml:space="preserve">Muestra consumido, porcentaje del tope, vencimiento y origen del consumo (recepción / factura).</w:t>
+            </w:r>
+          </w:p>
+        </w:tc>
+        <w:tc>
+          <w:tcPr>
+            <w:tcW w:w="2800" w:type="dxa"/>
+            <w:noWrap/>
+          </w:tcPr>
+          <w:p>
+            <w:pPr/>
+            <w:r>
+              <w:rPr>
+                <w:sz w:val="20"/>
+                <w:szCs w:val="20"/>
+              </w:rPr>
+              <w:t xml:space="preserve">listar-ordencompra</w:t>
+            </w:r>
+          </w:p>
+        </w:tc>
+      </w:tr>
+    </w:tbl>
+    <w:p/>
+    <w:p>
+      <w:pPr/>
+      <w:r>
+        <w:rPr>
+          <w:color w:val="666666"/>
+          <w:sz w:val="18"/>
+          <w:szCs w:val="18"/>
+          <w:i w:val="1"/>
+          <w:iCs w:val="1"/>
+        </w:rPr>
+        <w:t xml:space="preserve">Cómo se calcula el consumo del monto contratado</w:t>
+      </w:r>
+    </w:p>
+    <w:tbl>
+      <w:tblGrid>
+        <w:gridCol w:w="2800" w:type="dxa"/>
+        <w:gridCol w:w="2800" w:type="dxa"/>
+        <w:gridCol w:w="2800" w:type="dxa"/>
+      </w:tblGrid>
+      <w:tblPr>
+        <w:tblW w:w="0" w:type="auto"/>
+        <w:tblLayout w:type="autofit"/>
+        <w:tblCellMar>
+          <w:top w:w="80" w:type="dxa"/>
+          <w:left w:w="80" w:type="dxa"/>
+          <w:right w:w="80" w:type="dxa"/>
+          <w:bottom w:w="80" w:type="dxa"/>
+        </w:tblCellMar>
+        <w:tblBorders>
+          <w:top w:val="single" w:sz="6" w:color="AAAAAA"/>
+          <w:left w:val="single" w:sz="6" w:color="AAAAAA"/>
+          <w:right w:val="single" w:sz="6" w:color="AAAAAA"/>
+          <w:bottom w:val="single" w:sz="6" w:color="AAAAAA"/>
+          <w:insideH w:val="single" w:sz="6" w:color="AAAAAA"/>
+          <w:insideV w:val="single" w:sz="6" w:color="AAAAAA"/>
+        </w:tblBorders>
+      </w:tblPr>
+      <w:tr>
+        <w:trPr/>
+        <w:tc>
+          <w:tcPr>
+            <w:tcW w:w="2800" w:type="dxa"/>
+            <w:shd w:val="clear" w:fill="2E75B6"/>
+            <w:noWrap/>
+          </w:tcPr>
+          <w:p>
+            <w:pPr/>
+            <w:r>
+              <w:rPr>
+                <w:color w:val="FFFFFF"/>
+                <w:sz w:val="20"/>
+                <w:szCs w:val="20"/>
+                <w:b w:val="1"/>
+                <w:bCs w:val="1"/>
+              </w:rPr>
+              <w:t xml:space="preserve">Fuente</w:t>
+            </w:r>
+          </w:p>
+        </w:tc>
+        <w:tc>
+          <w:tcPr>
+            <w:tcW w:w="2800" w:type="dxa"/>
+            <w:shd w:val="clear" w:fill="2E75B6"/>
+            <w:noWrap/>
+          </w:tcPr>
+          <w:p>
+            <w:pPr/>
+            <w:r>
+              <w:rPr>
+                <w:color w:val="FFFFFF"/>
+                <w:sz w:val="20"/>
+                <w:szCs w:val="20"/>
+                <w:b w:val="1"/>
+                <w:bCs w:val="1"/>
+              </w:rPr>
+              <w:t xml:space="preserve">Qué computa</w:t>
+            </w:r>
+          </w:p>
+        </w:tc>
+        <w:tc>
+          <w:tcPr>
+            <w:tcW w:w="2800" w:type="dxa"/>
+            <w:shd w:val="clear" w:fill="2E75B6"/>
+            <w:noWrap/>
+          </w:tcPr>
+          <w:p>
+            <w:pPr/>
+            <w:r>
+              <w:rPr>
+                <w:color w:val="FFFFFF"/>
+                <w:sz w:val="20"/>
+                <w:szCs w:val="20"/>
+                <w:b w:val="1"/>
+                <w:bCs w:val="1"/>
+              </w:rPr>
+              <w:t xml:space="preserve">Cuándo manda</w:t>
+            </w:r>
+          </w:p>
+        </w:tc>
+      </w:tr>
+      <w:tr>
+        <w:trPr/>
+        <w:tc>
+          <w:tcPr>
+            <w:tcW w:w="2800" w:type="dxa"/>
+            <w:noWrap/>
+          </w:tcPr>
+          <w:p>
+            <w:pPr/>
+            <w:r>
+              <w:rPr>
+                <w:sz w:val="20"/>
+                <w:szCs w:val="20"/>
+              </w:rPr>
+              <w:t xml:space="preserve">Recepción de proveedor</w:t>
+            </w:r>
+          </w:p>
+        </w:tc>
+        <w:tc>
+          <w:tcPr>
+            <w:tcW w:w="2800" w:type="dxa"/>
+            <w:noWrap/>
+          </w:tcPr>
+          <w:p>
+            <w:pPr/>
+            <w:r>
+              <w:rPr>
+                <w:sz w:val="20"/>
+                <w:szCs w:val="20"/>
+              </w:rPr>
+              <w:t xml:space="preserve">Recepciones confirmadas de la OC, valorizadas por cantidad y precio de cada línea. Las devoluciones restan.</w:t>
+            </w:r>
+          </w:p>
+        </w:tc>
+        <w:tc>
+          <w:tcPr>
+            <w:tcW w:w="2800" w:type="dxa"/>
+            <w:noWrap/>
+          </w:tcPr>
+          <w:p>
+            <w:pPr/>
+            <w:r>
+              <w:rPr>
+                <w:sz w:val="20"/>
+                <w:szCs w:val="20"/>
+              </w:rPr>
+              <w:t xml:space="preserve">Fuente principal: marca el consumo apenas entra el bien o el servicio, sin esperar la factura.</w:t>
+            </w:r>
+          </w:p>
+        </w:tc>
+      </w:tr>
+      <w:tr>
+        <w:trPr/>
+        <w:tc>
+          <w:tcPr>
+            <w:tcW w:w="2800" w:type="dxa"/>
+            <w:noWrap/>
+          </w:tcPr>
+          <w:p>
+            <w:pPr/>
+            <w:r>
+              <w:rPr>
+                <w:sz w:val="20"/>
+                <w:szCs w:val="20"/>
+              </w:rPr>
+              <w:t xml:space="preserve">Factura de proveedor</w:t>
+            </w:r>
+          </w:p>
+        </w:tc>
+        <w:tc>
+          <w:tcPr>
+            <w:tcW w:w="2800" w:type="dxa"/>
+            <w:noWrap/>
+          </w:tcPr>
+          <w:p>
+            <w:pPr/>
+            <w:r>
+              <w:rPr>
+                <w:sz w:val="20"/>
+                <w:szCs w:val="20"/>
+              </w:rPr>
+              <w:t xml:space="preserve">Facturas de la OC que no tienen ninguna recepción vinculada.</w:t>
+            </w:r>
+          </w:p>
+        </w:tc>
+        <w:tc>
+          <w:tcPr>
+            <w:tcW w:w="2800" w:type="dxa"/>
+            <w:noWrap/>
+          </w:tcPr>
+          <w:p>
+            <w:pPr/>
+            <w:r>
+              <w:rPr>
+                <w:sz w:val="20"/>
+                <w:szCs w:val="20"/>
+              </w:rPr>
+              <w:t xml:space="preserve">Respaldo para lo que nunca pasa por recepción: abonos, honorarios, servicios.</w:t>
+            </w:r>
+          </w:p>
+        </w:tc>
+      </w:tr>
+      <w:tr>
+        <w:trPr/>
+        <w:tc>
+          <w:tcPr>
+            <w:tcW w:w="2800" w:type="dxa"/>
+            <w:noWrap/>
+          </w:tcPr>
+          <w:p>
+            <w:pPr/>
+            <w:r>
+              <w:rPr>
+                <w:sz w:val="20"/>
+                <w:szCs w:val="20"/>
+              </w:rPr>
+              <w:t xml:space="preserve">Factura (piso)</w:t>
+            </w:r>
+          </w:p>
+        </w:tc>
+        <w:tc>
+          <w:tcPr>
+            <w:tcW w:w="2800" w:type="dxa"/>
+            <w:noWrap/>
+          </w:tcPr>
+          <w:p>
+            <w:pPr/>
+            <w:r>
+              <w:rPr>
+                <w:sz w:val="20"/>
+                <w:szCs w:val="20"/>
+              </w:rPr>
+              <w:t xml:space="preserve">Total facturado de la OC, cuando resulta mayor que la suma anterior.</w:t>
+            </w:r>
+          </w:p>
+        </w:tc>
+        <w:tc>
+          <w:tcPr>
+            <w:tcW w:w="2800" w:type="dxa"/>
+            <w:noWrap/>
+          </w:tcPr>
+          <w:p>
+            <w:pPr/>
+            <w:r>
+              <w:rPr>
+                <w:sz w:val="20"/>
+                <w:szCs w:val="20"/>
+              </w:rPr>
+              <w:t xml:space="preserve">Red de seguridad si la recepción quedó sin precio o la factura terminó siendo mayor.</w:t>
+            </w:r>
+          </w:p>
+        </w:tc>
+      </w:tr>
+    </w:tbl>
+    <w:p/>
+    <w:p>
+      <w:pPr>
+        <w:pStyle w:val="Heading2"/>
+      </w:pPr>
+      <w:bookmarkStart w:id="12" w:name="_Toc12"/>
+      <w:r>
+        <w:t>12. Avisos y seguimiento de contratos</w:t>
+      </w:r>
+      <w:bookmarkEnd w:id="12"/>
+    </w:p>
+    <w:p>
+      <w:pPr>
+        <w:jc w:val="center"/>
+      </w:pPr>
+      <w:r>
+        <w:pict>
+          <v:shape type="#_x0000_t75" stroked="f" style="width:450pt; height:281.25pt; margin-left:0pt; margin-top:0pt; mso-position-horizontal:left; mso-position-vertical:top; mso-position-horizontal-relative:char; mso-position-vertical-relative:line;">
+            <w10:wrap type="inline"/>
+            <v:imagedata r:id="rId17" o:title=""/>
+          </v:shape>
+        </w:pict>
+      </w:r>
+    </w:p>
+    <w:p>
+      <w:pPr>
+        <w:jc w:val="center"/>
+      </w:pPr>
+      <w:r>
+        <w:rPr>
+          <w:color w:val="666666"/>
+          <w:sz w:val="18"/>
+          <w:szCs w:val="18"/>
+          <w:i w:val="1"/>
+          <w:iCs w:val="1"/>
+        </w:rPr>
+        <w:t xml:space="preserve">Reporte de contratos y OC abiertas por vencer</w:t>
+      </w:r>
+    </w:p>
+    <w:p/>
+    <w:p>
+      <w:pPr>
+        <w:jc w:val="center"/>
+      </w:pPr>
+      <w:r>
+        <w:pict>
+          <v:shape type="#_x0000_t75" stroked="f" style="width:450pt; height:281.25pt; margin-left:0pt; margin-top:0pt; mso-position-horizontal:left; mso-position-vertical:top; mso-position-horizontal-relative:char; mso-position-vertical-relative:line;">
+            <w10:wrap type="inline"/>
+            <v:imagedata r:id="rId17" o:title=""/>
+          </v:shape>
+        </w:pict>
+      </w:r>
+    </w:p>
+    <w:p>
+      <w:pPr>
+        <w:jc w:val="center"/>
+      </w:pPr>
+      <w:r>
+        <w:rPr>
+          <w:color w:val="666666"/>
+          <w:sz w:val="18"/>
+          <w:szCs w:val="18"/>
+          <w:i w:val="1"/>
+          <w:iCs w:val="1"/>
+        </w:rPr>
+        <w:t xml:space="preserve">Reporte de contratos y OC abiertas por vencer</w:t>
+      </w:r>
+    </w:p>
+    <w:p/>
+    <w:p>
+      <w:pPr>
+        <w:jc w:val="both"/>
+        <w:spacing w:after="120"/>
+      </w:pPr>
+      <w:r>
+        <w:rPr>
+          <w:sz w:val="22"/>
+          <w:szCs w:val="22"/>
+        </w:rPr>
+        <w:t xml:space="preserve">Un proceso automático diario revisa todos los contratos y envía un mail cuando alguno cruza un umbral. Solo se vigilan las OC marcadas como contrato que están en estado APROBADA o CUMPLIDA: las suspendidas y cerradas quedan afuera porque ya no admiten movimiento.</w:t>
+      </w:r>
+    </w:p>
+    <w:p>
+      <w:pPr>
+        <w:jc w:val="both"/>
+        <w:spacing w:after="120"/>
+      </w:pPr>
+      <w:r>
+        <w:rPr>
+          <w:sz w:val="22"/>
+          <w:szCs w:val="22"/>
+        </w:rPr>
+        <w:t xml:space="preserve">Cada umbral avisa una sola vez. Si un contrato ya figuró en el aviso de 60 días, no vuelve a aparecer hasta el umbral de 30. Esto evita el mail diario repetido que termina en que nadie lo lee. La excepción es el escalamiento de contratos vencidos, que se reitera cada 7 días hasta que el contrato se resuelva.</w:t>
+      </w:r>
+    </w:p>
+    <w:p>
+      <w:pPr>
+        <w:jc w:val="both"/>
+        <w:spacing w:after="120"/>
+      </w:pPr>
+      <w:r>
+        <w:rPr>
+          <w:sz w:val="22"/>
+          <w:szCs w:val="22"/>
+        </w:rPr>
+        <w:t xml:space="preserve">Los destinatarios y el texto de los mails se configuran en Configuración → Avisos por módulo, en los eventos "Contratos / OC abiertas por vencer" (preventivo) y "Contratos / OC abiertas vencidas (escalamiento)". Son dos eventos separados para que el escalamiento pueda ir a jefatura o gerencia sin sumar a esas personas al aviso preventivo de todos los días.</w:t>
+      </w:r>
+    </w:p>
+    <w:p>
+      <w:pPr>
+        <w:jc w:val="both"/>
+        <w:spacing w:after="120"/>
+      </w:pPr>
+      <w:r>
+        <w:rPr>
+          <w:sz w:val="22"/>
+          <w:szCs w:val="22"/>
+        </w:rPr>
+        <w:t xml:space="preserve">Para trabajar la lista completa, sin depender del mail, está el reporte Compras → Reportes → Contratos y OC abiertas (compras/contrato-vencimiento-reporte). Permite filtrar por empresa, tipo de alerta, horizonte de días, proveedor y responsable, y exportar a PDF, Excel o CSV.</w:t>
+      </w:r>
+    </w:p>
+    <w:p>
+      <w:pPr>
+        <w:numPr>
+          <w:ilvl w:val="0"/>
+          <w:numId w:val=""/>
+        </w:numPr>
+      </w:pPr>
+      <w:r>
+        <w:rPr/>
+        <w:t xml:space="preserve">Filtro Tipo de alerta: Todos, Por vencer (dentro del horizonte), Con preaviso de no renovación pendiente, Consumo del tope en zona de alerta, Vencidos, o Sin fecha de vigencia cargada. Esta última opción sirve para detectar contratos mal cargados, que son los que nunca van a avisar.</w:t>
+      </w:r>
+    </w:p>
+    <w:p>
+      <w:pPr>
+        <w:numPr>
+          <w:ilvl w:val="0"/>
+          <w:numId w:val=""/>
+        </w:numPr>
+      </w:pPr>
+      <w:r>
+        <w:rPr/>
+        <w:t xml:space="preserve">Días de horizonte: cuántos días hacia adelante mirar (90 por defecto).</w:t>
+      </w:r>
+    </w:p>
+    <w:p>
+      <w:pPr>
+        <w:numPr>
+          <w:ilvl w:val="0"/>
+          <w:numId w:val=""/>
+        </w:numPr>
+      </w:pPr>
+      <w:r>
+        <w:rPr/>
+        <w:t xml:space="preserve">Solo sin responsable: contratos sin dueño asignado. Conviene revisarlo periódicamente porque son los que se pierden.</w:t>
+      </w:r>
+    </w:p>
+    <w:p>
+      <w:pPr>
+        <w:numPr>
+          <w:ilvl w:val="0"/>
+          <w:numId w:val=""/>
+        </w:numPr>
+      </w:pPr>
+      <w:r>
+        <w:rPr/>
+        <w:t xml:space="preserve">En la grilla, las filas de contratos vencidos se marcan en rojo y las que vencen dentro de 30 días en amarillo. La columna Situación explica el motivo concreto de la alerta.</w:t>
+      </w:r>
+    </w:p>
+    <w:p>
+      <w:pPr>
+        <w:numPr>
+          <w:ilvl w:val="0"/>
+          <w:numId w:val=""/>
+        </w:numPr>
+      </w:pPr>
+      <w:r>
+        <w:rPr/>
+        <w:t xml:space="preserve">Las columnas Recibido, Facturado y Consumido permiten auditar el consumo: si Recibido y Facturado difieren mucho, hay recepciones sin facturar o facturas sin recepción.</w:t>
+      </w:r>
+    </w:p>
+    <w:p>
+      <w:pPr>
+        <w:numPr>
+          <w:ilvl w:val="0"/>
+          <w:numId w:val=""/>
+        </w:numPr>
+      </w:pPr>
+      <w:r>
+        <w:rPr/>
+        <w:t xml:space="preserve">El número de OC es un enlace: abre la orden de compra en una pestaña nueva para revisar o renovar el contrato.</w:t>
+      </w:r>
+    </w:p>
+    <w:p/>
+    <w:p>
+      <w:pPr/>
+      <w:r>
+        <w:rPr>
+          <w:color w:val="2E75B6"/>
+          <w:sz w:val="22"/>
+          <w:szCs w:val="22"/>
+          <w:b w:val="1"/>
+          <w:bCs w:val="1"/>
+        </w:rPr>
+        <w:t xml:space="preserve">Reporte de contratos y OC abiertas por vencer</w:t>
+      </w:r>
+    </w:p>
+    <w:tbl>
+      <w:tblGrid>
+        <w:gridCol w:w="2800" w:type="dxa"/>
+        <w:gridCol w:w="2800" w:type="dxa"/>
+        <w:gridCol w:w="2800" w:type="dxa"/>
+        <w:gridCol w:w="2800" w:type="dxa"/>
+      </w:tblGrid>
+      <w:tblPr>
+        <w:tblW w:w="0" w:type="auto"/>
+        <w:tblLayout w:type="autofit"/>
+        <w:tblCellMar>
+          <w:top w:w="80" w:type="dxa"/>
+          <w:left w:w="80" w:type="dxa"/>
+          <w:right w:w="80" w:type="dxa"/>
+          <w:bottom w:w="80" w:type="dxa"/>
+        </w:tblCellMar>
+        <w:tblBorders>
+          <w:top w:val="single" w:sz="6" w:color="AAAAAA"/>
+          <w:left w:val="single" w:sz="6" w:color="AAAAAA"/>
+          <w:right w:val="single" w:sz="6" w:color="AAAAAA"/>
+          <w:bottom w:val="single" w:sz="6" w:color="AAAAAA"/>
+          <w:insideH w:val="single" w:sz="6" w:color="AAAAAA"/>
+          <w:insideV w:val="single" w:sz="6" w:color="AAAAAA"/>
+        </w:tblBorders>
+      </w:tblPr>
+      <w:tr>
+        <w:trPr/>
+        <w:tc>
+          <w:tcPr>
+            <w:tcW w:w="2800" w:type="dxa"/>
+            <w:shd w:val="clear" w:fill="2E75B6"/>
+            <w:noWrap/>
+          </w:tcPr>
+          <w:p>
+            <w:pPr/>
+            <w:r>
+              <w:rPr>
+                <w:color w:val="FFFFFF"/>
+                <w:sz w:val="20"/>
+                <w:szCs w:val="20"/>
+                <w:b w:val="1"/>
+                <w:bCs w:val="1"/>
+              </w:rPr>
+              <w:t xml:space="preserve">Herramienta</w:t>
+            </w:r>
+          </w:p>
+        </w:tc>
+        <w:tc>
+          <w:tcPr>
+            <w:tcW w:w="2800" w:type="dxa"/>
+            <w:shd w:val="clear" w:fill="2E75B6"/>
+            <w:noWrap/>
+          </w:tcPr>
+          <w:p>
+            <w:pPr/>
+            <w:r>
+              <w:rPr>
+                <w:color w:val="FFFFFF"/>
+                <w:sz w:val="20"/>
+                <w:szCs w:val="20"/>
+                <w:b w:val="1"/>
+                <w:bCs w:val="1"/>
+              </w:rPr>
+              <w:t xml:space="preserve">Ubicación</w:t>
+            </w:r>
+          </w:p>
+        </w:tc>
+        <w:tc>
+          <w:tcPr>
+            <w:tcW w:w="2800" w:type="dxa"/>
+            <w:shd w:val="clear" w:fill="2E75B6"/>
+            <w:noWrap/>
+          </w:tcPr>
+          <w:p>
+            <w:pPr/>
+            <w:r>
+              <w:rPr>
+                <w:color w:val="FFFFFF"/>
+                <w:sz w:val="20"/>
+                <w:szCs w:val="20"/>
+                <w:b w:val="1"/>
+                <w:bCs w:val="1"/>
+              </w:rPr>
+              <w:t xml:space="preserve">Qué hace</w:t>
+            </w:r>
+          </w:p>
+        </w:tc>
+        <w:tc>
+          <w:tcPr>
+            <w:tcW w:w="2800" w:type="dxa"/>
+            <w:shd w:val="clear" w:fill="2E75B6"/>
+            <w:noWrap/>
+          </w:tcPr>
+          <w:p>
+            <w:pPr/>
+            <w:r>
+              <w:rPr>
+                <w:color w:val="FFFFFF"/>
+                <w:sz w:val="20"/>
+                <w:szCs w:val="20"/>
+                <w:b w:val="1"/>
+                <w:bCs w:val="1"/>
+              </w:rPr>
+              <w:t xml:space="preserve">Permiso</w:t>
+            </w:r>
+          </w:p>
+        </w:tc>
+      </w:tr>
+      <w:tr>
+        <w:trPr/>
+        <w:tc>
+          <w:tcPr>
+            <w:tcW w:w="2800" w:type="dxa"/>
+            <w:noWrap/>
+          </w:tcPr>
+          <w:p>
+            <w:pPr/>
+            <w:r>
+              <w:rPr>
+                <w:sz w:val="20"/>
+                <w:szCs w:val="20"/>
+              </w:rPr>
+              <w:t xml:space="preserve">Consultar</w:t>
+            </w:r>
+          </w:p>
+        </w:tc>
+        <w:tc>
+          <w:tcPr>
+            <w:tcW w:w="2800" w:type="dxa"/>
+            <w:noWrap/>
+          </w:tcPr>
+          <w:p>
+            <w:pPr/>
+            <w:r>
+              <w:rPr>
+                <w:sz w:val="20"/>
+                <w:szCs w:val="20"/>
+              </w:rPr>
+              <w:t xml:space="preserve">Panel de filtros</w:t>
+            </w:r>
+          </w:p>
+        </w:tc>
+        <w:tc>
+          <w:tcPr>
+            <w:tcW w:w="2800" w:type="dxa"/>
+            <w:noWrap/>
+          </w:tcPr>
+          <w:p>
+            <w:pPr/>
+            <w:r>
+              <w:rPr>
+                <w:sz w:val="20"/>
+                <w:szCs w:val="20"/>
+              </w:rPr>
+              <w:t xml:space="preserve">Genera el listado según empresa, tipo de alerta, horizonte de días, proveedor y responsable.</w:t>
+            </w:r>
+          </w:p>
+        </w:tc>
+        <w:tc>
+          <w:tcPr>
+            <w:tcW w:w="2800" w:type="dxa"/>
+            <w:noWrap/>
+          </w:tcPr>
+          <w:p>
+            <w:pPr/>
+            <w:r>
+              <w:rPr>
+                <w:sz w:val="20"/>
+                <w:szCs w:val="20"/>
+              </w:rPr>
+              <w:t xml:space="preserve">listar-reporte-contrato-vencimiento</w:t>
+            </w:r>
+          </w:p>
+        </w:tc>
+      </w:tr>
+      <w:tr>
+        <w:trPr/>
+        <w:tc>
+          <w:tcPr>
+            <w:tcW w:w="2800" w:type="dxa"/>
+            <w:noWrap/>
+          </w:tcPr>
+          <w:p>
+            <w:pPr/>
+            <w:r>
+              <w:rPr>
+                <w:sz w:val="20"/>
+                <w:szCs w:val="20"/>
+              </w:rPr>
+              <w:t xml:space="preserve">Tipo de alerta</w:t>
+            </w:r>
+          </w:p>
+        </w:tc>
+        <w:tc>
+          <w:tcPr>
+            <w:tcW w:w="2800" w:type="dxa"/>
+            <w:noWrap/>
+          </w:tcPr>
+          <w:p>
+            <w:pPr/>
+            <w:r>
+              <w:rPr>
+                <w:sz w:val="20"/>
+                <w:szCs w:val="20"/>
+              </w:rPr>
+              <w:t xml:space="preserve">Panel de filtros</w:t>
+            </w:r>
+          </w:p>
+        </w:tc>
+        <w:tc>
+          <w:tcPr>
+            <w:tcW w:w="2800" w:type="dxa"/>
+            <w:noWrap/>
+          </w:tcPr>
+          <w:p>
+            <w:pPr/>
+            <w:r>
+              <w:rPr>
+                <w:sz w:val="20"/>
+                <w:szCs w:val="20"/>
+              </w:rPr>
+              <w:t xml:space="preserve">Por vencer, preaviso pendiente, consumo en zona de alerta, vencidos o sin vigencia cargada.</w:t>
+            </w:r>
+          </w:p>
+        </w:tc>
+        <w:tc>
+          <w:tcPr>
+            <w:tcW w:w="2800" w:type="dxa"/>
+            <w:noWrap/>
+          </w:tcPr>
+          <w:p>
+            <w:pPr/>
+            <w:r>
+              <w:rPr>
+                <w:sz w:val="20"/>
+                <w:szCs w:val="20"/>
+              </w:rPr>
+              <w:t xml:space="preserve">listar-reporte-contrato-vencimiento</w:t>
+            </w:r>
+          </w:p>
+        </w:tc>
+      </w:tr>
+      <w:tr>
+        <w:trPr/>
+        <w:tc>
+          <w:tcPr>
+            <w:tcW w:w="2800" w:type="dxa"/>
+            <w:noWrap/>
+          </w:tcPr>
+          <w:p>
+            <w:pPr/>
+            <w:r>
+              <w:rPr>
+                <w:sz w:val="20"/>
+                <w:szCs w:val="20"/>
+              </w:rPr>
+              <w:t xml:space="preserve">Solo sin responsable</w:t>
+            </w:r>
+          </w:p>
+        </w:tc>
+        <w:tc>
+          <w:tcPr>
+            <w:tcW w:w="2800" w:type="dxa"/>
+            <w:noWrap/>
+          </w:tcPr>
+          <w:p>
+            <w:pPr/>
+            <w:r>
+              <w:rPr>
+                <w:sz w:val="20"/>
+                <w:szCs w:val="20"/>
+              </w:rPr>
+              <w:t xml:space="preserve">Panel de filtros</w:t>
+            </w:r>
+          </w:p>
+        </w:tc>
+        <w:tc>
+          <w:tcPr>
+            <w:tcW w:w="2800" w:type="dxa"/>
+            <w:noWrap/>
+          </w:tcPr>
+          <w:p>
+            <w:pPr/>
+            <w:r>
+              <w:rPr>
+                <w:sz w:val="20"/>
+                <w:szCs w:val="20"/>
+              </w:rPr>
+              <w:t xml:space="preserve">Aísla los contratos sin dueño asignado, que son los que suelen quedar sin seguimiento.</w:t>
+            </w:r>
+          </w:p>
+        </w:tc>
+        <w:tc>
+          <w:tcPr>
+            <w:tcW w:w="2800" w:type="dxa"/>
+            <w:noWrap/>
+          </w:tcPr>
+          <w:p>
+            <w:pPr/>
+            <w:r>
+              <w:rPr>
+                <w:sz w:val="20"/>
+                <w:szCs w:val="20"/>
+              </w:rPr>
+              <w:t xml:space="preserve">listar-reporte-contrato-vencimiento</w:t>
+            </w:r>
+          </w:p>
+        </w:tc>
+      </w:tr>
+      <w:tr>
+        <w:trPr/>
+        <w:tc>
+          <w:tcPr>
+            <w:tcW w:w="2800" w:type="dxa"/>
+            <w:noWrap/>
+          </w:tcPr>
+          <w:p>
+            <w:pPr/>
+            <w:r>
+              <w:rPr>
+                <w:sz w:val="20"/>
+                <w:szCs w:val="20"/>
+              </w:rPr>
+              <w:t xml:space="preserve">PDF / Excel / CSV</w:t>
+            </w:r>
+          </w:p>
+        </w:tc>
+        <w:tc>
+          <w:tcPr>
+            <w:tcW w:w="2800" w:type="dxa"/>
+            <w:noWrap/>
+          </w:tcPr>
+          <w:p>
+            <w:pPr/>
+            <w:r>
+              <w:rPr>
+                <w:sz w:val="20"/>
+                <w:szCs w:val="20"/>
+              </w:rPr>
+              <w:t xml:space="preserve">Barra de botones grandes sobre la grilla (btn-app)</w:t>
+            </w:r>
+          </w:p>
+        </w:tc>
+        <w:tc>
+          <w:tcPr>
+            <w:tcW w:w="2800" w:type="dxa"/>
+            <w:noWrap/>
+          </w:tcPr>
+          <w:p>
+            <w:pPr/>
+            <w:r>
+              <w:rPr>
+                <w:sz w:val="20"/>
+                <w:szCs w:val="20"/>
+              </w:rPr>
+              <w:t xml:space="preserve">Exporta el resultado completo del filtro, no solo la página visible.</w:t>
+            </w:r>
+          </w:p>
+        </w:tc>
+        <w:tc>
+          <w:tcPr>
+            <w:tcW w:w="2800" w:type="dxa"/>
+            <w:noWrap/>
+          </w:tcPr>
+          <w:p>
+            <w:pPr/>
+            <w:r>
+              <w:rPr>
+                <w:sz w:val="20"/>
+                <w:szCs w:val="20"/>
+              </w:rPr>
+              <w:t xml:space="preserve">listar-reporte-contrato-vencimiento</w:t>
+            </w:r>
+          </w:p>
+        </w:tc>
+      </w:tr>
+      <w:tr>
+        <w:trPr/>
+        <w:tc>
+          <w:tcPr>
+            <w:tcW w:w="2800" w:type="dxa"/>
+            <w:noWrap/>
+          </w:tcPr>
+          <w:p>
+            <w:pPr/>
+            <w:r>
+              <w:rPr>
+                <w:sz w:val="20"/>
+                <w:szCs w:val="20"/>
+              </w:rPr>
+              <w:t xml:space="preserve">Número de OC (enlace)</w:t>
+            </w:r>
+          </w:p>
+        </w:tc>
+        <w:tc>
+          <w:tcPr>
+            <w:tcW w:w="2800" w:type="dxa"/>
+            <w:noWrap/>
+          </w:tcPr>
+          <w:p>
+            <w:pPr/>
+            <w:r>
+              <w:rPr>
+                <w:sz w:val="20"/>
+                <w:szCs w:val="20"/>
+              </w:rPr>
+              <w:t xml:space="preserve">Columna OC de la grilla</w:t>
+            </w:r>
+          </w:p>
+        </w:tc>
+        <w:tc>
+          <w:tcPr>
+            <w:tcW w:w="2800" w:type="dxa"/>
+            <w:noWrap/>
+          </w:tcPr>
+          <w:p>
+            <w:pPr/>
+            <w:r>
+              <w:rPr>
+                <w:sz w:val="20"/>
+                <w:szCs w:val="20"/>
+              </w:rPr>
+              <w:t xml:space="preserve">Abre la orden de compra en pestaña nueva para revisar o renovar el contrato.</w:t>
+            </w:r>
+          </w:p>
+        </w:tc>
+        <w:tc>
+          <w:tcPr>
+            <w:tcW w:w="2800" w:type="dxa"/>
+            <w:noWrap/>
+          </w:tcPr>
+          <w:p>
+            <w:pPr/>
+            <w:r>
+              <w:rPr>
+                <w:sz w:val="20"/>
+                <w:szCs w:val="20"/>
+              </w:rPr>
+              <w:t xml:space="preserve">editar-ordencompra o listar-ordencompra</w:t>
+            </w:r>
+          </w:p>
+        </w:tc>
+      </w:tr>
+      <w:tr>
+        <w:trPr/>
+        <w:tc>
+          <w:tcPr>
+            <w:tcW w:w="2800" w:type="dxa"/>
+            <w:noWrap/>
+          </w:tcPr>
+          <w:p>
+            <w:pPr/>
+            <w:r>
+              <w:rPr>
+                <w:sz w:val="20"/>
+                <w:szCs w:val="20"/>
+              </w:rPr>
+              <w:t xml:space="preserve">Resumen del filtro</w:t>
+            </w:r>
+          </w:p>
+        </w:tc>
+        <w:tc>
+          <w:tcPr>
+            <w:tcW w:w="2800" w:type="dxa"/>
+            <w:noWrap/>
+          </w:tcPr>
+          <w:p>
+            <w:pPr/>
+            <w:r>
+              <w:rPr>
+                <w:sz w:val="20"/>
+                <w:szCs w:val="20"/>
+              </w:rPr>
+              <w:t xml:space="preserve">Franja sobre la grilla</w:t>
+            </w:r>
+          </w:p>
+        </w:tc>
+        <w:tc>
+          <w:tcPr>
+            <w:tcW w:w="2800" w:type="dxa"/>
+            <w:noWrap/>
+          </w:tcPr>
+          <w:p>
+            <w:pPr/>
+            <w:r>
+              <w:rPr>
+                <w:sz w:val="20"/>
+                <w:szCs w:val="20"/>
+              </w:rPr>
+              <w:t xml:space="preserve">Totales de contratos, vencidos, por vencer, tope, recibido, facturado, consumido y disponible.</w:t>
+            </w:r>
+          </w:p>
+        </w:tc>
+        <w:tc>
+          <w:tcPr>
+            <w:tcW w:w="2800" w:type="dxa"/>
+            <w:noWrap/>
+          </w:tcPr>
+          <w:p>
+            <w:pPr/>
+            <w:r>
+              <w:rPr>
+                <w:sz w:val="20"/>
+                <w:szCs w:val="20"/>
+              </w:rPr>
+              <w:t xml:space="preserve">listar-reporte-contrato-vencimiento</w:t>
+            </w:r>
+          </w:p>
+        </w:tc>
+      </w:tr>
+    </w:tbl>
+    <w:p/>
+    <w:p>
+      <w:pPr/>
+      <w:r>
+        <w:rPr>
+          <w:color w:val="666666"/>
+          <w:sz w:val="18"/>
+          <w:szCs w:val="18"/>
+          <w:i w:val="1"/>
+          <w:iCs w:val="1"/>
+        </w:rPr>
+        <w:t xml:space="preserve">Tipos de aviso</w:t>
+      </w:r>
+    </w:p>
+    <w:tbl>
+      <w:tblGrid>
+        <w:gridCol w:w="2800" w:type="dxa"/>
+        <w:gridCol w:w="2800" w:type="dxa"/>
+        <w:gridCol w:w="2800" w:type="dxa"/>
+      </w:tblGrid>
+      <w:tblPr>
+        <w:tblW w:w="0" w:type="auto"/>
+        <w:tblLayout w:type="autofit"/>
+        <w:tblCellMar>
+          <w:top w:w="80" w:type="dxa"/>
+          <w:left w:w="80" w:type="dxa"/>
+          <w:right w:w="80" w:type="dxa"/>
+          <w:bottom w:w="80" w:type="dxa"/>
+        </w:tblCellMar>
+        <w:tblBorders>
+          <w:top w:val="single" w:sz="6" w:color="AAAAAA"/>
+          <w:left w:val="single" w:sz="6" w:color="AAAAAA"/>
+          <w:right w:val="single" w:sz="6" w:color="AAAAAA"/>
+          <w:bottom w:val="single" w:sz="6" w:color="AAAAAA"/>
+          <w:insideH w:val="single" w:sz="6" w:color="AAAAAA"/>
+          <w:insideV w:val="single" w:sz="6" w:color="AAAAAA"/>
+        </w:tblBorders>
+      </w:tblPr>
+      <w:tr>
+        <w:trPr/>
+        <w:tc>
+          <w:tcPr>
+            <w:tcW w:w="2800" w:type="dxa"/>
+            <w:shd w:val="clear" w:fill="2E75B6"/>
+            <w:noWrap/>
+          </w:tcPr>
+          <w:p>
+            <w:pPr/>
+            <w:r>
+              <w:rPr>
+                <w:color w:val="FFFFFF"/>
+                <w:sz w:val="20"/>
+                <w:szCs w:val="20"/>
+                <w:b w:val="1"/>
+                <w:bCs w:val="1"/>
+              </w:rPr>
+              <w:t xml:space="preserve">Aviso</w:t>
+            </w:r>
+          </w:p>
+        </w:tc>
+        <w:tc>
+          <w:tcPr>
+            <w:tcW w:w="2800" w:type="dxa"/>
+            <w:shd w:val="clear" w:fill="2E75B6"/>
+            <w:noWrap/>
+          </w:tcPr>
+          <w:p>
+            <w:pPr/>
+            <w:r>
+              <w:rPr>
+                <w:color w:val="FFFFFF"/>
+                <w:sz w:val="20"/>
+                <w:szCs w:val="20"/>
+                <w:b w:val="1"/>
+                <w:bCs w:val="1"/>
+              </w:rPr>
+              <w:t xml:space="preserve">Cuándo se dispara</w:t>
+            </w:r>
+          </w:p>
+        </w:tc>
+        <w:tc>
+          <w:tcPr>
+            <w:tcW w:w="2800" w:type="dxa"/>
+            <w:shd w:val="clear" w:fill="2E75B6"/>
+            <w:noWrap/>
+          </w:tcPr>
+          <w:p>
+            <w:pPr/>
+            <w:r>
+              <w:rPr>
+                <w:color w:val="FFFFFF"/>
+                <w:sz w:val="20"/>
+                <w:szCs w:val="20"/>
+                <w:b w:val="1"/>
+                <w:bCs w:val="1"/>
+              </w:rPr>
+              <w:t xml:space="preserve">Qué hay que hacer</w:t>
+            </w:r>
+          </w:p>
+        </w:tc>
+      </w:tr>
+      <w:tr>
+        <w:trPr/>
+        <w:tc>
+          <w:tcPr>
+            <w:tcW w:w="2800" w:type="dxa"/>
+            <w:noWrap/>
+          </w:tcPr>
+          <w:p>
+            <w:pPr/>
+            <w:r>
+              <w:rPr>
+                <w:sz w:val="20"/>
+                <w:szCs w:val="20"/>
+              </w:rPr>
+              <w:t xml:space="preserve">Por vencer</w:t>
+            </w:r>
+          </w:p>
+        </w:tc>
+        <w:tc>
+          <w:tcPr>
+            <w:tcW w:w="2800" w:type="dxa"/>
+            <w:noWrap/>
+          </w:tcPr>
+          <w:p>
+            <w:pPr/>
+            <w:r>
+              <w:rPr>
+                <w:sz w:val="20"/>
+                <w:szCs w:val="20"/>
+              </w:rPr>
+              <w:t xml:space="preserve">Cuando faltan tantos días para el fin de vigencia como indica el umbral (60, 30 y 15 días por defecto).</w:t>
+            </w:r>
+          </w:p>
+        </w:tc>
+        <w:tc>
+          <w:tcPr>
+            <w:tcW w:w="2800" w:type="dxa"/>
+            <w:noWrap/>
+          </w:tcPr>
+          <w:p>
+            <w:pPr/>
+            <w:r>
+              <w:rPr>
+                <w:sz w:val="20"/>
+                <w:szCs w:val="20"/>
+              </w:rPr>
+              <w:t xml:space="preserve">Renovar, renegociar o dejar vencer con decisión tomada.</w:t>
+            </w:r>
+          </w:p>
+        </w:tc>
+      </w:tr>
+      <w:tr>
+        <w:trPr/>
+        <w:tc>
+          <w:tcPr>
+            <w:tcW w:w="2800" w:type="dxa"/>
+            <w:noWrap/>
+          </w:tcPr>
+          <w:p>
+            <w:pPr/>
+            <w:r>
+              <w:rPr>
+                <w:sz w:val="20"/>
+                <w:szCs w:val="20"/>
+              </w:rPr>
+              <w:t xml:space="preserve">Preaviso de no renovación</w:t>
+            </w:r>
+          </w:p>
+        </w:tc>
+        <w:tc>
+          <w:tcPr>
+            <w:tcW w:w="2800" w:type="dxa"/>
+            <w:noWrap/>
+          </w:tcPr>
+          <w:p>
+            <w:pPr/>
+            <w:r>
+              <w:rPr>
+                <w:sz w:val="20"/>
+                <w:szCs w:val="20"/>
+              </w:rPr>
+              <w:t xml:space="preserve">Contratos con renovación automática, cuando se acerca la fecha límite para notificar la no renovación.</w:t>
+            </w:r>
+          </w:p>
+        </w:tc>
+        <w:tc>
+          <w:tcPr>
+            <w:tcW w:w="2800" w:type="dxa"/>
+            <w:noWrap/>
+          </w:tcPr>
+          <w:p>
+            <w:pPr/>
+            <w:r>
+              <w:rPr>
+                <w:sz w:val="20"/>
+                <w:szCs w:val="20"/>
+              </w:rPr>
+              <w:t xml:space="preserve">Notificar al proveedor antes de esa fecha si no se quiere continuar. Pasada la fecha, el contrato se renueva solo.</w:t>
+            </w:r>
+          </w:p>
+        </w:tc>
+      </w:tr>
+      <w:tr>
+        <w:trPr/>
+        <w:tc>
+          <w:tcPr>
+            <w:tcW w:w="2800" w:type="dxa"/>
+            <w:noWrap/>
+          </w:tcPr>
+          <w:p>
+            <w:pPr/>
+            <w:r>
+              <w:rPr>
+                <w:sz w:val="20"/>
+                <w:szCs w:val="20"/>
+              </w:rPr>
+              <w:t xml:space="preserve">Consumo del tope</w:t>
+            </w:r>
+          </w:p>
+        </w:tc>
+        <w:tc>
+          <w:tcPr>
+            <w:tcW w:w="2800" w:type="dxa"/>
+            <w:noWrap/>
+          </w:tcPr>
+          <w:p>
+            <w:pPr/>
+            <w:r>
+              <w:rPr>
+                <w:sz w:val="20"/>
+                <w:szCs w:val="20"/>
+              </w:rPr>
+              <w:t xml:space="preserve">Cuando el consumo alcanza el porcentaje configurado del monto contratado (80% y 100% por defecto).</w:t>
+            </w:r>
+          </w:p>
+        </w:tc>
+        <w:tc>
+          <w:tcPr>
+            <w:tcW w:w="2800" w:type="dxa"/>
+            <w:noWrap/>
+          </w:tcPr>
+          <w:p>
+            <w:pPr/>
+            <w:r>
+              <w:rPr>
+                <w:sz w:val="20"/>
+                <w:szCs w:val="20"/>
+              </w:rPr>
+              <w:t xml:space="preserve">Ampliar el monto contratado o emitir una OC nueva antes de seguir consumiendo.</w:t>
+            </w:r>
+          </w:p>
+        </w:tc>
+      </w:tr>
+      <w:tr>
+        <w:trPr/>
+        <w:tc>
+          <w:tcPr>
+            <w:tcW w:w="2800" w:type="dxa"/>
+            <w:noWrap/>
+          </w:tcPr>
+          <w:p>
+            <w:pPr/>
+            <w:r>
+              <w:rPr>
+                <w:sz w:val="20"/>
+                <w:szCs w:val="20"/>
+              </w:rPr>
+              <w:t xml:space="preserve">Vencido (escalamiento)</w:t>
+            </w:r>
+          </w:p>
+        </w:tc>
+        <w:tc>
+          <w:tcPr>
+            <w:tcW w:w="2800" w:type="dxa"/>
+            <w:noWrap/>
+          </w:tcPr>
+          <w:p>
+            <w:pPr/>
+            <w:r>
+              <w:rPr>
+                <w:sz w:val="20"/>
+                <w:szCs w:val="20"/>
+              </w:rPr>
+              <w:t xml:space="preserve">Vigencia terminada y el contrato sigue abierto. Se reitera cada 7 días.</w:t>
+            </w:r>
+          </w:p>
+        </w:tc>
+        <w:tc>
+          <w:tcPr>
+            <w:tcW w:w="2800" w:type="dxa"/>
+            <w:noWrap/>
+          </w:tcPr>
+          <w:p>
+            <w:pPr/>
+            <w:r>
+              <w:rPr>
+                <w:sz w:val="20"/>
+                <w:szCs w:val="20"/>
+              </w:rPr>
+              <w:t xml:space="preserve">Renovar, cerrar la OC o darla de baja. Es el aviso que no debería existir.</w:t>
+            </w:r>
+          </w:p>
+        </w:tc>
+      </w:tr>
+    </w:tbl>
+    <w:p/>
+    <w:p>
+      <w:pPr>
+        <w:pStyle w:val="Heading2"/>
+      </w:pPr>
+      <w:bookmarkStart w:id="13" w:name="_Toc13"/>
+      <w:r>
+        <w:t>13. Circuito documental integrado</w:t>
+      </w:r>
+      <w:bookmarkEnd w:id="13"/>
     </w:p>
     <w:p>
       <w:pPr>
@@ -9025,7 +11475,7 @@
         <w:pict>
           <v:shape type="#_x0000_t75" stroked="f" style="width:450pt; height:195.65217391304pt; margin-left:0pt; margin-top:0pt; mso-position-horizontal:left; mso-position-vertical:top; mso-position-horizontal-relative:char; mso-position-vertical-relative:line;">
             <w10:wrap type="inline"/>
-            <v:imagedata r:id="rId14" o:title=""/>
+            <v:imagedata r:id="rId18" o:title=""/>
           </v:shape>
         </w:pict>
       </w:r>
@@ -9074,13 +11524,26 @@
     </w:p>
     <w:p>
       <w:pPr>
+        <w:jc w:val="both"/>
+        <w:spacing w:after="120"/>
+      </w:pPr>
+      <w:r>
+        <w:rPr>
+          <w:sz w:val="22"/>
+          <w:szCs w:val="22"/>
+        </w:rPr>
+        <w:t xml:space="preserve">Las OC marcadas como contrato no siguen ese cierre: quedan vigentes durante todo el período contratado y se van consumiendo con recepciones y facturas sucesivas, hasta que se renuevan o se cierran (ver capítulos 11 y 12).</w:t>
+      </w:r>
+    </w:p>
+    <w:p>
+      <w:pPr>
         <w:pStyle w:val="Heading2"/>
       </w:pPr>
-      <w:bookmarkStart w:id="12" w:name="_Toc12"/>
-      <w:r>
-        <w:t>12. Integración con sistema Anita</w:t>
-      </w:r>
-      <w:bookmarkEnd w:id="12"/>
+      <w:bookmarkStart w:id="14" w:name="_Toc14"/>
+      <w:r>
+        <w:t>14. Integración con sistema Anita</w:t>
+      </w:r>
+      <w:bookmarkEnd w:id="14"/>
     </w:p>
     <w:p>
       <w:pPr>
@@ -9148,11 +11611,11 @@
       <w:pPr>
         <w:pStyle w:val="Heading2"/>
       </w:pPr>
-      <w:bookmarkStart w:id="13" w:name="_Toc13"/>
-      <w:r>
-        <w:t>13. Resolución de problemas frecuentes</w:t>
-      </w:r>
-      <w:bookmarkEnd w:id="13"/>
+      <w:bookmarkStart w:id="15" w:name="_Toc15"/>
+      <w:r>
+        <w:t>15. Resolución de problemas frecuentes</w:t>
+      </w:r>
+      <w:bookmarkEnd w:id="15"/>
     </w:p>
     <w:p>
       <w:pPr>
@@ -9214,16 +11677,64 @@
         <w:t xml:space="preserve">Error de CUIT duplicado en proveedor: revise tipo de servicio y reglas de unicidad configuradas.</w:t>
       </w:r>
     </w:p>
+    <w:p>
+      <w:pPr>
+        <w:numPr>
+          <w:ilvl w:val="0"/>
+          <w:numId w:val=""/>
+        </w:numPr>
+      </w:pPr>
+      <w:r>
+        <w:rPr/>
+        <w:t xml:space="preserve">Un contrato no avisa nunca: verifique que la OC tenga tildado "Contrato / OC abierta", que tenga fecha de vigencia hasta (o monto contratado) y que esté en estado APROBADA o CUMPLIDA. El filtro "Sin fecha de vigencia cargada" del reporte lista justamente estos casos.</w:t>
+      </w:r>
+    </w:p>
+    <w:p>
+      <w:pPr>
+        <w:numPr>
+          <w:ilvl w:val="0"/>
+          <w:numId w:val=""/>
+        </w:numPr>
+      </w:pPr>
+      <w:r>
+        <w:rPr/>
+        <w:t xml:space="preserve">No recibí el mail del contrato: cada umbral avisa una sola vez, así que si el aviso de 60 días ya salió no se repite hasta los 30. Confirme además que su usuario esté como responsable del contrato o como destinatario del evento en Configuración → Avisos por módulo.</w:t>
+      </w:r>
+    </w:p>
+    <w:p>
+      <w:pPr>
+        <w:numPr>
+          <w:ilvl w:val="0"/>
+          <w:numId w:val=""/>
+        </w:numPr>
+      </w:pPr>
+      <w:r>
+        <w:rPr/>
+        <w:t xml:space="preserve">El consumo del contrato no coincide con lo facturado: el consumo toma primero las recepciones confirmadas y suma las facturas sin recepción vinculada. Compare las columnas Recibido, Facturado y Consumido del reporte: la diferencia suele ser mercadería recibida y todavía no facturada.</w:t>
+      </w:r>
+    </w:p>
+    <w:p>
+      <w:pPr>
+        <w:numPr>
+          <w:ilvl w:val="0"/>
+          <w:numId w:val=""/>
+        </w:numPr>
+      </w:pPr>
+      <w:r>
+        <w:rPr/>
+        <w:t xml:space="preserve">El consumo quedó en cero con recepciones cargadas: revise que las líneas de la recepción tengan precio. Si la OC no tenía precio, la recepción se valoriza en cero y el consumo recién aparece cuando llega la factura.</w:t>
+      </w:r>
+    </w:p>
     <w:p/>
     <w:p>
       <w:pPr>
         <w:pStyle w:val="Heading2"/>
       </w:pPr>
-      <w:bookmarkStart w:id="14" w:name="_Toc14"/>
-      <w:r>
-        <w:t>14. Soporte</w:t>
-      </w:r>
-      <w:bookmarkEnd w:id="14"/>
+      <w:bookmarkStart w:id="16" w:name="_Toc16"/>
+      <w:r>
+        <w:t>16. Soporte</w:t>
+      </w:r>
+      <w:bookmarkEnd w:id="16"/>
     </w:p>
     <w:p>
       <w:pPr>

</xml_diff>

<commit_message>
Mejoras en contratos para facturas sin COM, reporte de bingo y posicion financiera
</commit_message>
<xml_diff>
--- a/docs/manual-compras/Manual_Usuario_AnitaERP_Modulo_Compras.docx
+++ b/docs/manual-compras/Manual_Usuario_AnitaERP_Modulo_Compras.docx
@@ -60,7 +60,7 @@
           <w:sz w:val="22"/>
           <w:szCs w:val="22"/>
         </w:rPr>
-        <w:t xml:space="preserve">Versión 1.4 — agosto 2026</w:t>
+        <w:t xml:space="preserve">Versión 1.6 — agosto 2026</w:t>
       </w:r>
     </w:p>
     <w:p/>
@@ -209,7 +209,7 @@
           <w:sz w:val="22"/>
           <w:szCs w:val="22"/>
         </w:rPr>
-        <w:t xml:space="preserve">12. Avisos y seguimiento de contratos</w:t>
+        <w:t xml:space="preserve">12. Carga de facturas de un contrato</w:t>
       </w:r>
     </w:p>
     <w:p>
@@ -219,7 +219,7 @@
           <w:sz w:val="22"/>
           <w:szCs w:val="22"/>
         </w:rPr>
-        <w:t xml:space="preserve">13. Circuito documental integrado</w:t>
+        <w:t xml:space="preserve">13. Avisos y seguimiento de contratos</w:t>
       </w:r>
     </w:p>
     <w:p>
@@ -229,7 +229,7 @@
           <w:sz w:val="22"/>
           <w:szCs w:val="22"/>
         </w:rPr>
-        <w:t xml:space="preserve">14. Integración con sistema Anita</w:t>
+        <w:t xml:space="preserve">14. Circuito documental integrado</w:t>
       </w:r>
     </w:p>
     <w:p>
@@ -239,7 +239,7 @@
           <w:sz w:val="22"/>
           <w:szCs w:val="22"/>
         </w:rPr>
-        <w:t xml:space="preserve">15. Resolución de problemas frecuentes</w:t>
+        <w:t xml:space="preserve">15. Integración con sistema Anita</w:t>
       </w:r>
     </w:p>
     <w:p>
@@ -249,7 +249,17 @@
           <w:sz w:val="22"/>
           <w:szCs w:val="22"/>
         </w:rPr>
-        <w:t xml:space="preserve">16. Soporte</w:t>
+        <w:t xml:space="preserve">16. Resolución de problemas frecuentes</w:t>
+      </w:r>
+    </w:p>
+    <w:p>
+      <w:pPr/>
+      <w:r>
+        <w:rPr>
+          <w:sz w:val="22"/>
+          <w:szCs w:val="22"/>
+        </w:rPr>
+        <w:t xml:space="preserve">17. Soporte</w:t>
       </w:r>
     </w:p>
     <w:p>
@@ -9472,7 +9482,7 @@
           <w:sz w:val="22"/>
           <w:szCs w:val="22"/>
         </w:rPr>
-        <w:t xml:space="preserve">Una OC abierta es la que no se agota con una entrega: abonos, honorarios profesionales, servicios recurrentes, mantenimientos, alquileres, licencias. En lugar de crear un documento distinto, la propia orden de compra se marca como contrato y se le cargan la vigencia, el monto contratado y el responsable. El ERP vigila esos datos y avisa antes del vencimiento, con el mismo criterio que los acuerdos marco de SAP o los purchase agreements de Oracle.</w:t>
+        <w:t xml:space="preserve">Una OC abierta es la que no se agota con una entrega: abonos, honorarios profesionales, servicios recurrentes, mantenimientos, alquileres, licencias. En lugar de crear un documento distinto, la propia orden de compra se marca como contrato y se le cargan la vigencia, el monto contratado, el responsable y la ruta con la que se van a cargar las facturas. El ERP vigila esos datos y avisa antes del vencimiento, con el mismo criterio que los acuerdos marco de SAP o los purchase agreements de Oracle.</w:t>
       </w:r>
     </w:p>
     <w:p>
@@ -9485,7 +9495,7 @@
           <w:sz w:val="22"/>
           <w:szCs w:val="22"/>
         </w:rPr>
-        <w:t xml:space="preserve">Se marca en el formulario de la orden de compra (compras/ordencompra/crear o editar) tildando la casilla "Contrato / OC abierta" en el bloque del mismo nombre. Recién al tildarla se despliegan los campos de vigencia, tope y avisos; una OC común no muestra nada de esto.</w:t>
+        <w:t xml:space="preserve">Se marca en el formulario de la orden de compra (compras/ordencompra/crear o editar) tildando la casilla "Contrato / OC abierta" en el bloque del mismo nombre. Recién al tildarla se despliegan los campos de vigencia, tope, avisos y ruta de facturación; una OC común no muestra nada de esto.</w:t>
       </w:r>
     </w:p>
     <w:p>
@@ -9498,7 +9508,7 @@
           <w:sz w:val="22"/>
           <w:szCs w:val="22"/>
         </w:rPr>
-        <w:t xml:space="preserve">Cargar la vigencia es lo mínimo indispensable: sin fecha de fin no hay aviso de vencimiento posible. El monto contratado es opcional, pero es lo que habilita el control de consumo.</w:t>
+        <w:t xml:space="preserve">Cargar la vigencia es lo mínimo indispensable: sin fecha de fin no hay aviso de vencimiento posible. El monto contratado es opcional, pero es lo que habilita el control de consumo. La recepción para facturar y la cuenta contable definen cómo se carga cada factura de ese contrato (capítulo 12).</w:t>
       </w:r>
     </w:p>
     <w:p>
@@ -9571,6 +9581,30 @@
       <w:r>
         <w:rPr/>
         <w:t xml:space="preserve">Responsable: usuario dueño del contrato. Recibe siempre los avisos de sus contratos, además de los destinatarios generales configurados.</w:t>
+      </w:r>
+    </w:p>
+    <w:p>
+      <w:pPr>
+        <w:numPr>
+          <w:ilvl w:val="0"/>
+          <w:numId w:val=""/>
+        </w:numPr>
+      </w:pPr>
+      <w:r>
+        <w:rPr/>
+        <w:t xml:space="preserve">Recepción para facturar: Obligatoria (las facturas se cargan contra recepción COM) o No requiere recepción (se factura el contrato sin COM: abonos, honorarios, servicios). Este dato fija la ruta del formulario de factura mientras el contrato esté vigente.</w:t>
+      </w:r>
+    </w:p>
+    <w:p>
+      <w:pPr>
+        <w:numPr>
+          <w:ilvl w:val="0"/>
+          <w:numId w:val=""/>
+        </w:numPr>
+      </w:pPr>
+      <w:r>
+        <w:rPr/>
+        <w:t xml:space="preserve">Cuenta contable de las facturas: solo aparece si la ruta es sin recepción. Puede tomarse de los artículos de la OC o de una cuenta indicada en el propio contrato. Si elige "Cuenta indicada en este contrato", aparece el campo Cuenta a imputar (código + Enter o lupa). El IVA y las percepciones siguen siempre el concepto de IVA compra; lo que cambia es la cuenta DEBE del neto.</w:t>
       </w:r>
     </w:p>
     <w:p>
@@ -10123,6 +10157,207 @@
                 <w:sz w:val="20"/>
                 <w:szCs w:val="20"/>
               </w:rPr>
+              <w:t xml:space="preserve">Recepción para facturar</w:t>
+            </w:r>
+          </w:p>
+        </w:tc>
+        <w:tc>
+          <w:tcPr>
+            <w:tcW w:w="2800" w:type="dxa"/>
+            <w:noWrap/>
+          </w:tcPr>
+          <w:p>
+            <w:pPr/>
+            <w:r>
+              <w:rPr>
+                <w:sz w:val="20"/>
+                <w:szCs w:val="20"/>
+              </w:rPr>
+              <w:t xml:space="preserve">Bloque Contrato</w:t>
+            </w:r>
+          </w:p>
+        </w:tc>
+        <w:tc>
+          <w:tcPr>
+            <w:tcW w:w="2800" w:type="dxa"/>
+            <w:noWrap/>
+          </w:tcPr>
+          <w:p>
+            <w:pPr/>
+            <w:r>
+              <w:rPr>
+                <w:sz w:val="20"/>
+                <w:szCs w:val="20"/>
+              </w:rPr>
+              <w:t xml:space="preserve">Obligatoria (factura contra COM) o no requiere recepción (abonos, honorarios). Fija la ruta de la factura mientras el contrato esté vigente.</w:t>
+            </w:r>
+          </w:p>
+        </w:tc>
+        <w:tc>
+          <w:tcPr>
+            <w:tcW w:w="2800" w:type="dxa"/>
+            <w:noWrap/>
+          </w:tcPr>
+          <w:p>
+            <w:pPr/>
+            <w:r>
+              <w:rPr>
+                <w:sz w:val="20"/>
+                <w:szCs w:val="20"/>
+              </w:rPr>
+              <w:t xml:space="preserve">crear-ordencompra / editar-ordencompra</w:t>
+            </w:r>
+          </w:p>
+        </w:tc>
+      </w:tr>
+      <w:tr>
+        <w:trPr/>
+        <w:tc>
+          <w:tcPr>
+            <w:tcW w:w="2800" w:type="dxa"/>
+            <w:noWrap/>
+          </w:tcPr>
+          <w:p>
+            <w:pPr/>
+            <w:r>
+              <w:rPr>
+                <w:sz w:val="20"/>
+                <w:szCs w:val="20"/>
+              </w:rPr>
+              <w:t xml:space="preserve">Cuenta contable de las facturas</w:t>
+            </w:r>
+          </w:p>
+        </w:tc>
+        <w:tc>
+          <w:tcPr>
+            <w:tcW w:w="2800" w:type="dxa"/>
+            <w:noWrap/>
+          </w:tcPr>
+          <w:p>
+            <w:pPr/>
+            <w:r>
+              <w:rPr>
+                <w:sz w:val="20"/>
+                <w:szCs w:val="20"/>
+              </w:rPr>
+              <w:t xml:space="preserve">Bloque Contrato (solo si no requiere recepción)</w:t>
+            </w:r>
+          </w:p>
+        </w:tc>
+        <w:tc>
+          <w:tcPr>
+            <w:tcW w:w="2800" w:type="dxa"/>
+            <w:noWrap/>
+          </w:tcPr>
+          <w:p>
+            <w:pPr/>
+            <w:r>
+              <w:rPr>
+                <w:sz w:val="20"/>
+                <w:szCs w:val="20"/>
+              </w:rPr>
+              <w:t xml:space="preserve">De los artículos de la OC, o cuenta indicada en este contrato. Aplica al neto; IVA y percepciones siguen el concepto de IVA compra.</w:t>
+            </w:r>
+          </w:p>
+        </w:tc>
+        <w:tc>
+          <w:tcPr>
+            <w:tcW w:w="2800" w:type="dxa"/>
+            <w:noWrap/>
+          </w:tcPr>
+          <w:p>
+            <w:pPr/>
+            <w:r>
+              <w:rPr>
+                <w:sz w:val="20"/>
+                <w:szCs w:val="20"/>
+              </w:rPr>
+              <w:t xml:space="preserve">crear-ordencompra / editar-ordencompra</w:t>
+            </w:r>
+          </w:p>
+        </w:tc>
+      </w:tr>
+      <w:tr>
+        <w:trPr/>
+        <w:tc>
+          <w:tcPr>
+            <w:tcW w:w="2800" w:type="dxa"/>
+            <w:noWrap/>
+          </w:tcPr>
+          <w:p>
+            <w:pPr/>
+            <w:r>
+              <w:rPr>
+                <w:sz w:val="20"/>
+                <w:szCs w:val="20"/>
+              </w:rPr>
+              <w:t xml:space="preserve">Cuenta a imputar</w:t>
+            </w:r>
+          </w:p>
+        </w:tc>
+        <w:tc>
+          <w:tcPr>
+            <w:tcW w:w="2800" w:type="dxa"/>
+            <w:noWrap/>
+          </w:tcPr>
+          <w:p>
+            <w:pPr/>
+            <w:r>
+              <w:rPr>
+                <w:sz w:val="20"/>
+                <w:szCs w:val="20"/>
+              </w:rPr>
+              <w:t xml:space="preserve">Bloque Contrato (si la imputación no es por artículos)</w:t>
+            </w:r>
+          </w:p>
+        </w:tc>
+        <w:tc>
+          <w:tcPr>
+            <w:tcW w:w="2800" w:type="dxa"/>
+            <w:noWrap/>
+          </w:tcPr>
+          <w:p>
+            <w:pPr/>
+            <w:r>
+              <w:rPr>
+                <w:sz w:val="20"/>
+                <w:szCs w:val="20"/>
+              </w:rPr>
+              <w:t xml:space="preserve">Código + Enter o lupa para indicar la cuenta DEBE del neto de todas las facturas del contrato. Obligatoria. Debe ser de la misma empresa de la OC.</w:t>
+            </w:r>
+          </w:p>
+        </w:tc>
+        <w:tc>
+          <w:tcPr>
+            <w:tcW w:w="2800" w:type="dxa"/>
+            <w:noWrap/>
+          </w:tcPr>
+          <w:p>
+            <w:pPr/>
+            <w:r>
+              <w:rPr>
+                <w:sz w:val="20"/>
+                <w:szCs w:val="20"/>
+              </w:rPr>
+              <w:t xml:space="preserve">crear-ordencompra / editar-ordencompra</w:t>
+            </w:r>
+          </w:p>
+        </w:tc>
+      </w:tr>
+      <w:tr>
+        <w:trPr/>
+        <w:tc>
+          <w:tcPr>
+            <w:tcW w:w="2800" w:type="dxa"/>
+            <w:noWrap/>
+          </w:tcPr>
+          <w:p>
+            <w:pPr/>
+            <w:r>
+              <w:rPr>
+                <w:sz w:val="20"/>
+                <w:szCs w:val="20"/>
+              </w:rPr>
               <w:t xml:space="preserve">Estado actual</w:t>
             </w:r>
           </w:p>
@@ -10439,68 +10674,10 @@
       </w:pPr>
       <w:bookmarkStart w:id="12" w:name="_Toc12"/>
       <w:r>
-        <w:t>12. Avisos y seguimiento de contratos</w:t>
+        <w:t>12. Carga de facturas de un contrato</w:t>
       </w:r>
       <w:bookmarkEnd w:id="12"/>
     </w:p>
-    <w:p>
-      <w:pPr>
-        <w:jc w:val="center"/>
-      </w:pPr>
-      <w:r>
-        <w:pict>
-          <v:shape type="#_x0000_t75" stroked="f" style="width:450pt; height:281.25pt; margin-left:0pt; margin-top:0pt; mso-position-horizontal:left; mso-position-vertical:top; mso-position-horizontal-relative:char; mso-position-vertical-relative:line;">
-            <w10:wrap type="inline"/>
-            <v:imagedata r:id="rId17" o:title=""/>
-          </v:shape>
-        </w:pict>
-      </w:r>
-    </w:p>
-    <w:p>
-      <w:pPr>
-        <w:jc w:val="center"/>
-      </w:pPr>
-      <w:r>
-        <w:rPr>
-          <w:color w:val="666666"/>
-          <w:sz w:val="18"/>
-          <w:szCs w:val="18"/>
-          <w:i w:val="1"/>
-          <w:iCs w:val="1"/>
-        </w:rPr>
-        <w:t xml:space="preserve">Reporte de contratos y OC abiertas por vencer</w:t>
-      </w:r>
-    </w:p>
-    <w:p/>
-    <w:p>
-      <w:pPr>
-        <w:jc w:val="center"/>
-      </w:pPr>
-      <w:r>
-        <w:pict>
-          <v:shape type="#_x0000_t75" stroked="f" style="width:450pt; height:281.25pt; margin-left:0pt; margin-top:0pt; mso-position-horizontal:left; mso-position-vertical:top; mso-position-horizontal-relative:char; mso-position-vertical-relative:line;">
-            <w10:wrap type="inline"/>
-            <v:imagedata r:id="rId17" o:title=""/>
-          </v:shape>
-        </w:pict>
-      </w:r>
-    </w:p>
-    <w:p>
-      <w:pPr>
-        <w:jc w:val="center"/>
-      </w:pPr>
-      <w:r>
-        <w:rPr>
-          <w:color w:val="666666"/>
-          <w:sz w:val="18"/>
-          <w:szCs w:val="18"/>
-          <w:i w:val="1"/>
-          <w:iCs w:val="1"/>
-        </w:rPr>
-        <w:t xml:space="preserve">Reporte de contratos y OC abiertas por vencer</w:t>
-      </w:r>
-    </w:p>
-    <w:p/>
     <w:p>
       <w:pPr>
         <w:jc w:val="both"/>
@@ -10511,7 +10688,7 @@
           <w:sz w:val="22"/>
           <w:szCs w:val="22"/>
         </w:rPr>
-        <w:t xml:space="preserve">Un proceso automático diario revisa todos los contratos y envía un mail cuando alguno cruza un umbral. Solo se vigilan las OC marcadas como contrato que están en estado APROBADA o CUMPLIDA: las suspendidas y cerradas quedan afuera porque ya no admiten movimiento.</w:t>
+        <w:t xml:space="preserve">Cuando una orden de compra tiene un contrato vigente, el ERP no deja elegir libremente cómo cargar la factura: usa la ruta y la imputación definidas en el contrato. Eso evita facturar un abono como si fuera mercadería (exigiendo una COM que nunca va a existir) o, al revés, saltarse la recepción en un contrato que sí la necesita.</w:t>
       </w:r>
     </w:p>
     <w:p>
@@ -10524,7 +10701,7 @@
           <w:sz w:val="22"/>
           <w:szCs w:val="22"/>
         </w:rPr>
-        <w:t xml:space="preserve">Cada umbral avisa una sola vez. Si un contrato ya figuró en el aviso de 60 días, no vuelve a aparecer hasta el umbral de 30. Esto evita el mail diario repetido que termina en que nadie lo lee. La excepción es el escalamiento de contratos vencidos, que se reitera cada 7 días hasta que el contrato se resuelva.</w:t>
+        <w:t xml:space="preserve">El punto de entrada es Compras → Comprobantes de proveedor → Cargar factura, opción "Con OC". Se ingresa el número de orden (6 dígitos, como en Anita). Si esa OC es un contrato vigente a la fecha del comprobante, el formulario abre ya fijado: modo de carga, solapa de recepciones COM y origen de la cuenta del neto.</w:t>
       </w:r>
     </w:p>
     <w:p>
@@ -10537,20 +10714,7 @@
           <w:sz w:val="22"/>
           <w:szCs w:val="22"/>
         </w:rPr>
-        <w:t xml:space="preserve">Los destinatarios y el texto de los mails se configuran en Configuración → Avisos por módulo, en los eventos "Contratos / OC abiertas por vencer" (preventivo) y "Contratos / OC abiertas vencidas (escalamiento)". Son dos eventos separados para que el escalamiento pueda ir a jefatura o gerencia sin sumar a esas personas al aviso preventivo de todos los días.</w:t>
-      </w:r>
-    </w:p>
-    <w:p>
-      <w:pPr>
-        <w:jc w:val="both"/>
-        <w:spacing w:after="120"/>
-      </w:pPr>
-      <w:r>
-        <w:rPr>
-          <w:sz w:val="22"/>
-          <w:szCs w:val="22"/>
-        </w:rPr>
-        <w:t xml:space="preserve">Para trabajar la lista completa, sin depender del mail, está el reporte Compras → Reportes → Contratos y OC abiertas (compras/contrato-vencimiento-reporte). Permite filtrar por empresa, tipo de alerta, horizonte de días, proveedor y responsable, y exportar a PDF, Excel o CSV.</w:t>
+        <w:t xml:space="preserve">Vigente significa que la fecha de la factura cae dentro de "Vigencia desde / hasta" (si alguna de las dos fechas está vacía, ese extremo no restringe). Si el contrato todavía no empezó o ya venció, la factura sigue el flujo estándar de la empresa y el formulario avisa que el contrato no está vigente.</w:t>
       </w:r>
     </w:p>
     <w:p>
@@ -10562,7 +10726,7 @@
       </w:pPr>
       <w:r>
         <w:rPr/>
-        <w:t xml:space="preserve">Filtro Tipo de alerta: Todos, Por vencer (dentro del horizonte), Con preaviso de no renovación pendiente, Consumo del tope en zona de alerta, Vencidos, o Sin fecha de vigencia cargada. Esta última opción sirve para detectar contratos mal cargados, que son los que nunca van a avisar.</w:t>
+        <w:t xml:space="preserve">Contrato con recepción obligatoria: el modo queda en "Factura contra recepción (COM)". Hay que confirmar una recepción con provisión antes de grabar la factura. Sin COM, el sistema bloquea la carga.</w:t>
       </w:r>
     </w:p>
     <w:p>
@@ -10574,7 +10738,7 @@
       </w:pPr>
       <w:r>
         <w:rPr/>
-        <w:t xml:space="preserve">Días de horizonte: cuántos días hacia adelante mirar (90 por defecto).</w:t>
+        <w:t xml:space="preserve">Contrato sin recepción: el modo queda en "Gasto sin recepción". No se pide COM aunque la empresa tenga flujo estricto OC/COM/factura, y no se trata como factura anticipada.</w:t>
       </w:r>
     </w:p>
     <w:p>
@@ -10586,7 +10750,7 @@
       </w:pPr>
       <w:r>
         <w:rPr/>
-        <w:t xml:space="preserve">Solo sin responsable: contratos sin dueño asignado. Conviene revisarlo periódicamente porque son los que se pierden.</w:t>
+        <w:t xml:space="preserve">Imputación desde artículos de la OC: el neto de la factura se contabiliza en las cuentas de compras/gastos de los renglones de la orden, prorrateadas por el importe de cada ítem. La OC tiene que tener artículos con cuenta cargada.</w:t>
       </w:r>
     </w:p>
     <w:p>
@@ -10598,7 +10762,7 @@
       </w:pPr>
       <w:r>
         <w:rPr/>
-        <w:t xml:space="preserve">En la grilla, las filas de contratos vencidos se marcan en rojo y las que vencen dentro de 30 días en amarillo. La columna Situación explica el motivo concreto de la alerta.</w:t>
+        <w:t xml:space="preserve">Imputación con cuenta del contrato: en el bloque Contrato hay que cargar la cuenta a imputar. Esa cuenta se usa como DEBE del neto en cada factura (queda precargada en la solapa de conceptos y se puede cambiar en el renglón si hace falta). IVA y percepciones siguen la cuenta del concepto de IVA compra.</w:t>
       </w:r>
     </w:p>
     <w:p>
@@ -10610,7 +10774,7 @@
       </w:pPr>
       <w:r>
         <w:rPr/>
-        <w:t xml:space="preserve">Las columnas Recibido, Facturado y Consumido permiten auditar el consumo: si Recibido y Facturado difieren mucho, hay recepciones sin facturar o facturas sin recepción.</w:t>
+        <w:t xml:space="preserve">En la cabecera de la factura, junto al número de OC, se muestran badges: Contrato vigente, Recepción obligatoria o Sin recepción, y el origen de la cuenta (artículos OC o cuenta del contrato, con código y nombre).</w:t>
       </w:r>
     </w:p>
     <w:p>
@@ -10622,7 +10786,7 @@
       </w:pPr>
       <w:r>
         <w:rPr/>
-        <w:t xml:space="preserve">El número de OC es un enlace: abre la orden de compra en una pestaña nueva para revisar o renovar el contrato.</w:t>
+        <w:t xml:space="preserve">La misma regla aplica si la factura entra por precarga (agente, API o PDF con IA) y la OC resuelta es un contrato vigente: el modo y la imputación se toman del contrato, no de la COM que pudiera haber en el legajo.</w:t>
       </w:r>
     </w:p>
     <w:p/>
@@ -10636,7 +10800,7 @@
           <w:b w:val="1"/>
           <w:bCs w:val="1"/>
         </w:rPr>
-        <w:t xml:space="preserve">Reporte de contratos y OC abiertas por vencer</w:t>
+        <w:t xml:space="preserve">Factura de proveedor vinculada a un contrato</w:t>
       </w:r>
     </w:p>
     <w:tbl>
@@ -10761,390 +10925,323 @@
                 <w:sz w:val="20"/>
                 <w:szCs w:val="20"/>
               </w:rPr>
-              <w:t xml:space="preserve">Consultar</w:t>
-            </w:r>
-          </w:p>
-        </w:tc>
-        <w:tc>
-          <w:tcPr>
-            <w:tcW w:w="2800" w:type="dxa"/>
-            <w:noWrap/>
-          </w:tcPr>
-          <w:p>
-            <w:pPr/>
-            <w:r>
-              <w:rPr>
-                <w:sz w:val="20"/>
-                <w:szCs w:val="20"/>
-              </w:rPr>
-              <w:t xml:space="preserve">Panel de filtros</w:t>
-            </w:r>
-          </w:p>
-        </w:tc>
-        <w:tc>
-          <w:tcPr>
-            <w:tcW w:w="2800" w:type="dxa"/>
-            <w:noWrap/>
-          </w:tcPr>
-          <w:p>
-            <w:pPr/>
-            <w:r>
-              <w:rPr>
-                <w:sz w:val="20"/>
-                <w:szCs w:val="20"/>
-              </w:rPr>
-              <w:t xml:space="preserve">Genera el listado según empresa, tipo de alerta, horizonte de días, proveedor y responsable.</w:t>
-            </w:r>
-          </w:p>
-        </w:tc>
-        <w:tc>
-          <w:tcPr>
-            <w:tcW w:w="2800" w:type="dxa"/>
-            <w:noWrap/>
-          </w:tcPr>
-          <w:p>
-            <w:pPr/>
-            <w:r>
-              <w:rPr>
-                <w:sz w:val="20"/>
-                <w:szCs w:val="20"/>
-              </w:rPr>
-              <w:t xml:space="preserve">listar-reporte-contrato-vencimiento</w:t>
-            </w:r>
-          </w:p>
-        </w:tc>
-      </w:tr>
-      <w:tr>
-        <w:trPr/>
-        <w:tc>
-          <w:tcPr>
-            <w:tcW w:w="2800" w:type="dxa"/>
-            <w:noWrap/>
-          </w:tcPr>
-          <w:p>
-            <w:pPr/>
-            <w:r>
-              <w:rPr>
-                <w:sz w:val="20"/>
-                <w:szCs w:val="20"/>
-              </w:rPr>
-              <w:t xml:space="preserve">Tipo de alerta</w:t>
-            </w:r>
-          </w:p>
-        </w:tc>
-        <w:tc>
-          <w:tcPr>
-            <w:tcW w:w="2800" w:type="dxa"/>
-            <w:noWrap/>
-          </w:tcPr>
-          <w:p>
-            <w:pPr/>
-            <w:r>
-              <w:rPr>
-                <w:sz w:val="20"/>
-                <w:szCs w:val="20"/>
-              </w:rPr>
-              <w:t xml:space="preserve">Panel de filtros</w:t>
-            </w:r>
-          </w:p>
-        </w:tc>
-        <w:tc>
-          <w:tcPr>
-            <w:tcW w:w="2800" w:type="dxa"/>
-            <w:noWrap/>
-          </w:tcPr>
-          <w:p>
-            <w:pPr/>
-            <w:r>
-              <w:rPr>
-                <w:sz w:val="20"/>
-                <w:szCs w:val="20"/>
-              </w:rPr>
-              <w:t xml:space="preserve">Por vencer, preaviso pendiente, consumo en zona de alerta, vencidos o sin vigencia cargada.</w:t>
-            </w:r>
-          </w:p>
-        </w:tc>
-        <w:tc>
-          <w:tcPr>
-            <w:tcW w:w="2800" w:type="dxa"/>
-            <w:noWrap/>
-          </w:tcPr>
-          <w:p>
-            <w:pPr/>
-            <w:r>
-              <w:rPr>
-                <w:sz w:val="20"/>
-                <w:szCs w:val="20"/>
-              </w:rPr>
-              <w:t xml:space="preserve">listar-reporte-contrato-vencimiento</w:t>
-            </w:r>
-          </w:p>
-        </w:tc>
-      </w:tr>
-      <w:tr>
-        <w:trPr/>
-        <w:tc>
-          <w:tcPr>
-            <w:tcW w:w="2800" w:type="dxa"/>
-            <w:noWrap/>
-          </w:tcPr>
-          <w:p>
-            <w:pPr/>
-            <w:r>
-              <w:rPr>
-                <w:sz w:val="20"/>
-                <w:szCs w:val="20"/>
-              </w:rPr>
-              <w:t xml:space="preserve">Solo sin responsable</w:t>
-            </w:r>
-          </w:p>
-        </w:tc>
-        <w:tc>
-          <w:tcPr>
-            <w:tcW w:w="2800" w:type="dxa"/>
-            <w:noWrap/>
-          </w:tcPr>
-          <w:p>
-            <w:pPr/>
-            <w:r>
-              <w:rPr>
-                <w:sz w:val="20"/>
-                <w:szCs w:val="20"/>
-              </w:rPr>
-              <w:t xml:space="preserve">Panel de filtros</w:t>
-            </w:r>
-          </w:p>
-        </w:tc>
-        <w:tc>
-          <w:tcPr>
-            <w:tcW w:w="2800" w:type="dxa"/>
-            <w:noWrap/>
-          </w:tcPr>
-          <w:p>
-            <w:pPr/>
-            <w:r>
-              <w:rPr>
-                <w:sz w:val="20"/>
-                <w:szCs w:val="20"/>
-              </w:rPr>
-              <w:t xml:space="preserve">Aísla los contratos sin dueño asignado, que son los que suelen quedar sin seguimiento.</w:t>
-            </w:r>
-          </w:p>
-        </w:tc>
-        <w:tc>
-          <w:tcPr>
-            <w:tcW w:w="2800" w:type="dxa"/>
-            <w:noWrap/>
-          </w:tcPr>
-          <w:p>
-            <w:pPr/>
-            <w:r>
-              <w:rPr>
-                <w:sz w:val="20"/>
-                <w:szCs w:val="20"/>
-              </w:rPr>
-              <w:t xml:space="preserve">listar-reporte-contrato-vencimiento</w:t>
-            </w:r>
-          </w:p>
-        </w:tc>
-      </w:tr>
-      <w:tr>
-        <w:trPr/>
-        <w:tc>
-          <w:tcPr>
-            <w:tcW w:w="2800" w:type="dxa"/>
-            <w:noWrap/>
-          </w:tcPr>
-          <w:p>
-            <w:pPr/>
-            <w:r>
-              <w:rPr>
-                <w:sz w:val="20"/>
-                <w:szCs w:val="20"/>
-              </w:rPr>
-              <w:t xml:space="preserve">PDF / Excel / CSV</w:t>
-            </w:r>
-          </w:p>
-        </w:tc>
-        <w:tc>
-          <w:tcPr>
-            <w:tcW w:w="2800" w:type="dxa"/>
-            <w:noWrap/>
-          </w:tcPr>
-          <w:p>
-            <w:pPr/>
-            <w:r>
-              <w:rPr>
-                <w:sz w:val="20"/>
-                <w:szCs w:val="20"/>
-              </w:rPr>
-              <w:t xml:space="preserve">Barra de botones grandes sobre la grilla (btn-app)</w:t>
-            </w:r>
-          </w:p>
-        </w:tc>
-        <w:tc>
-          <w:tcPr>
-            <w:tcW w:w="2800" w:type="dxa"/>
-            <w:noWrap/>
-          </w:tcPr>
-          <w:p>
-            <w:pPr/>
-            <w:r>
-              <w:rPr>
-                <w:sz w:val="20"/>
-                <w:szCs w:val="20"/>
-              </w:rPr>
-              <w:t xml:space="preserve">Exporta el resultado completo del filtro, no solo la página visible.</w:t>
-            </w:r>
-          </w:p>
-        </w:tc>
-        <w:tc>
-          <w:tcPr>
-            <w:tcW w:w="2800" w:type="dxa"/>
-            <w:noWrap/>
-          </w:tcPr>
-          <w:p>
-            <w:pPr/>
-            <w:r>
-              <w:rPr>
-                <w:sz w:val="20"/>
-                <w:szCs w:val="20"/>
-              </w:rPr>
-              <w:t xml:space="preserve">listar-reporte-contrato-vencimiento</w:t>
-            </w:r>
-          </w:p>
-        </w:tc>
-      </w:tr>
-      <w:tr>
-        <w:trPr/>
-        <w:tc>
-          <w:tcPr>
-            <w:tcW w:w="2800" w:type="dxa"/>
-            <w:noWrap/>
-          </w:tcPr>
-          <w:p>
-            <w:pPr/>
-            <w:r>
-              <w:rPr>
-                <w:sz w:val="20"/>
-                <w:szCs w:val="20"/>
-              </w:rPr>
-              <w:t xml:space="preserve">Número de OC (enlace)</w:t>
-            </w:r>
-          </w:p>
-        </w:tc>
-        <w:tc>
-          <w:tcPr>
-            <w:tcW w:w="2800" w:type="dxa"/>
-            <w:noWrap/>
-          </w:tcPr>
-          <w:p>
-            <w:pPr/>
-            <w:r>
-              <w:rPr>
-                <w:sz w:val="20"/>
-                <w:szCs w:val="20"/>
-              </w:rPr>
-              <w:t xml:space="preserve">Columna OC de la grilla</w:t>
-            </w:r>
-          </w:p>
-        </w:tc>
-        <w:tc>
-          <w:tcPr>
-            <w:tcW w:w="2800" w:type="dxa"/>
-            <w:noWrap/>
-          </w:tcPr>
-          <w:p>
-            <w:pPr/>
-            <w:r>
-              <w:rPr>
-                <w:sz w:val="20"/>
-                <w:szCs w:val="20"/>
-              </w:rPr>
-              <w:t xml:space="preserve">Abre la orden de compra en pestaña nueva para revisar o renovar el contrato.</w:t>
-            </w:r>
-          </w:p>
-        </w:tc>
-        <w:tc>
-          <w:tcPr>
-            <w:tcW w:w="2800" w:type="dxa"/>
-            <w:noWrap/>
-          </w:tcPr>
-          <w:p>
-            <w:pPr/>
-            <w:r>
-              <w:rPr>
-                <w:sz w:val="20"/>
-                <w:szCs w:val="20"/>
-              </w:rPr>
-              <w:t xml:space="preserve">editar-ordencompra o listar-ordencompra</w:t>
-            </w:r>
-          </w:p>
-        </w:tc>
-      </w:tr>
-      <w:tr>
-        <w:trPr/>
-        <w:tc>
-          <w:tcPr>
-            <w:tcW w:w="2800" w:type="dxa"/>
-            <w:noWrap/>
-          </w:tcPr>
-          <w:p>
-            <w:pPr/>
-            <w:r>
-              <w:rPr>
-                <w:sz w:val="20"/>
-                <w:szCs w:val="20"/>
-              </w:rPr>
-              <w:t xml:space="preserve">Resumen del filtro</w:t>
-            </w:r>
-          </w:p>
-        </w:tc>
-        <w:tc>
-          <w:tcPr>
-            <w:tcW w:w="2800" w:type="dxa"/>
-            <w:noWrap/>
-          </w:tcPr>
-          <w:p>
-            <w:pPr/>
-            <w:r>
-              <w:rPr>
-                <w:sz w:val="20"/>
-                <w:szCs w:val="20"/>
-              </w:rPr>
-              <w:t xml:space="preserve">Franja sobre la grilla</w:t>
-            </w:r>
-          </w:p>
-        </w:tc>
-        <w:tc>
-          <w:tcPr>
-            <w:tcW w:w="2800" w:type="dxa"/>
-            <w:noWrap/>
-          </w:tcPr>
-          <w:p>
-            <w:pPr/>
-            <w:r>
-              <w:rPr>
-                <w:sz w:val="20"/>
-                <w:szCs w:val="20"/>
-              </w:rPr>
-              <w:t xml:space="preserve">Totales de contratos, vencidos, por vencer, tope, recibido, facturado, consumido y disponible.</w:t>
-            </w:r>
-          </w:p>
-        </w:tc>
-        <w:tc>
-          <w:tcPr>
-            <w:tcW w:w="2800" w:type="dxa"/>
-            <w:noWrap/>
-          </w:tcPr>
-          <w:p>
-            <w:pPr/>
-            <w:r>
-              <w:rPr>
-                <w:sz w:val="20"/>
-                <w:szCs w:val="20"/>
-              </w:rPr>
-              <w:t xml:space="preserve">listar-reporte-contrato-vencimiento</w:t>
+              <w:t xml:space="preserve">Con OC (número de 6 dígitos)</w:t>
+            </w:r>
+          </w:p>
+        </w:tc>
+        <w:tc>
+          <w:tcPr>
+            <w:tcW w:w="2800" w:type="dxa"/>
+            <w:noWrap/>
+          </w:tcPr>
+          <w:p>
+            <w:pPr/>
+            <w:r>
+              <w:rPr>
+                <w:sz w:val="20"/>
+                <w:szCs w:val="20"/>
+              </w:rPr>
+              <w:t xml:space="preserve">Compras → Comprobantes de proveedor → Cargar factura</w:t>
+            </w:r>
+          </w:p>
+        </w:tc>
+        <w:tc>
+          <w:tcPr>
+            <w:tcW w:w="2800" w:type="dxa"/>
+            <w:noWrap/>
+          </w:tcPr>
+          <w:p>
+            <w:pPr/>
+            <w:r>
+              <w:rPr>
+                <w:sz w:val="20"/>
+                <w:szCs w:val="20"/>
+              </w:rPr>
+              <w:t xml:space="preserve">Abre la factura vinculada a la orden. Si hay contrato vigente, fija el modo de carga y la imputación del neto.</w:t>
+            </w:r>
+          </w:p>
+        </w:tc>
+        <w:tc>
+          <w:tcPr>
+            <w:tcW w:w="2800" w:type="dxa"/>
+            <w:noWrap/>
+          </w:tcPr>
+          <w:p>
+            <w:pPr/>
+            <w:r>
+              <w:rPr>
+                <w:sz w:val="20"/>
+                <w:szCs w:val="20"/>
+              </w:rPr>
+              <w:t xml:space="preserve">crear-comprobante-proveedor</w:t>
+            </w:r>
+          </w:p>
+        </w:tc>
+      </w:tr>
+      <w:tr>
+        <w:trPr/>
+        <w:tc>
+          <w:tcPr>
+            <w:tcW w:w="2800" w:type="dxa"/>
+            <w:noWrap/>
+          </w:tcPr>
+          <w:p>
+            <w:pPr/>
+            <w:r>
+              <w:rPr>
+                <w:sz w:val="20"/>
+                <w:szCs w:val="20"/>
+              </w:rPr>
+              <w:t xml:space="preserve">Modo de carga (fijo por contrato)</w:t>
+            </w:r>
+          </w:p>
+        </w:tc>
+        <w:tc>
+          <w:tcPr>
+            <w:tcW w:w="2800" w:type="dxa"/>
+            <w:noWrap/>
+          </w:tcPr>
+          <w:p>
+            <w:pPr/>
+            <w:r>
+              <w:rPr>
+                <w:sz w:val="20"/>
+                <w:szCs w:val="20"/>
+              </w:rPr>
+              <w:t xml:space="preserve">Solapa Datos principales de la factura</w:t>
+            </w:r>
+          </w:p>
+        </w:tc>
+        <w:tc>
+          <w:tcPr>
+            <w:tcW w:w="2800" w:type="dxa"/>
+            <w:noWrap/>
+          </w:tcPr>
+          <w:p>
+            <w:pPr/>
+            <w:r>
+              <w:rPr>
+                <w:sz w:val="20"/>
+                <w:szCs w:val="20"/>
+              </w:rPr>
+              <w:t xml:space="preserve">Con recepción obligatoria queda en factura contra COM; sin recepción queda en gasto sin recepción. No se puede cambiar mientras el contrato esté vigente.</w:t>
+            </w:r>
+          </w:p>
+        </w:tc>
+        <w:tc>
+          <w:tcPr>
+            <w:tcW w:w="2800" w:type="dxa"/>
+            <w:noWrap/>
+          </w:tcPr>
+          <w:p>
+            <w:pPr/>
+            <w:r>
+              <w:rPr>
+                <w:sz w:val="20"/>
+                <w:szCs w:val="20"/>
+              </w:rPr>
+              <w:t xml:space="preserve">crear-comprobante-proveedor / editar-comprobante-proveedor</w:t>
+            </w:r>
+          </w:p>
+        </w:tc>
+      </w:tr>
+      <w:tr>
+        <w:trPr/>
+        <w:tc>
+          <w:tcPr>
+            <w:tcW w:w="2800" w:type="dxa"/>
+            <w:noWrap/>
+          </w:tcPr>
+          <w:p>
+            <w:pPr/>
+            <w:r>
+              <w:rPr>
+                <w:sz w:val="20"/>
+                <w:szCs w:val="20"/>
+              </w:rPr>
+              <w:t xml:space="preserve">Solapa Recepciones COM</w:t>
+            </w:r>
+          </w:p>
+        </w:tc>
+        <w:tc>
+          <w:tcPr>
+            <w:tcW w:w="2800" w:type="dxa"/>
+            <w:noWrap/>
+          </w:tcPr>
+          <w:p>
+            <w:pPr/>
+            <w:r>
+              <w:rPr>
+                <w:sz w:val="20"/>
+                <w:szCs w:val="20"/>
+              </w:rPr>
+              <w:t xml:space="preserve">Factura contra COM</w:t>
+            </w:r>
+          </w:p>
+        </w:tc>
+        <w:tc>
+          <w:tcPr>
+            <w:tcW w:w="2800" w:type="dxa"/>
+            <w:noWrap/>
+          </w:tcPr>
+          <w:p>
+            <w:pPr/>
+            <w:r>
+              <w:rPr>
+                <w:sz w:val="20"/>
+                <w:szCs w:val="20"/>
+              </w:rPr>
+              <w:t xml:space="preserve">Solo aparece si el contrato exige recepción. Hay que elegir la COM con provisión antes de grabar.</w:t>
+            </w:r>
+          </w:p>
+        </w:tc>
+        <w:tc>
+          <w:tcPr>
+            <w:tcW w:w="2800" w:type="dxa"/>
+            <w:noWrap/>
+          </w:tcPr>
+          <w:p>
+            <w:pPr/>
+            <w:r>
+              <w:rPr>
+                <w:sz w:val="20"/>
+                <w:szCs w:val="20"/>
+              </w:rPr>
+              <w:t xml:space="preserve">crear-comprobante-proveedor / editar-comprobante-proveedor</w:t>
+            </w:r>
+          </w:p>
+        </w:tc>
+      </w:tr>
+      <w:tr>
+        <w:trPr/>
+        <w:tc>
+          <w:tcPr>
+            <w:tcW w:w="2800" w:type="dxa"/>
+            <w:noWrap/>
+          </w:tcPr>
+          <w:p>
+            <w:pPr/>
+            <w:r>
+              <w:rPr>
+                <w:sz w:val="20"/>
+                <w:szCs w:val="20"/>
+              </w:rPr>
+              <w:t xml:space="preserve">Cuenta DEBE del neto</w:t>
+            </w:r>
+          </w:p>
+        </w:tc>
+        <w:tc>
+          <w:tcPr>
+            <w:tcW w:w="2800" w:type="dxa"/>
+            <w:noWrap/>
+          </w:tcPr>
+          <w:p>
+            <w:pPr/>
+            <w:r>
+              <w:rPr>
+                <w:sz w:val="20"/>
+                <w:szCs w:val="20"/>
+              </w:rPr>
+              <w:t xml:space="preserve">Solapa Conceptos de IVA (ruta sin recepción y cuenta del contrato)</w:t>
+            </w:r>
+          </w:p>
+        </w:tc>
+        <w:tc>
+          <w:tcPr>
+            <w:tcW w:w="2800" w:type="dxa"/>
+            <w:noWrap/>
+          </w:tcPr>
+          <w:p>
+            <w:pPr/>
+            <w:r>
+              <w:rPr>
+                <w:sz w:val="20"/>
+                <w:szCs w:val="20"/>
+              </w:rPr>
+              <w:t xml:space="preserve">Queda precargada con la cuenta del contrato. Código + Enter o lupa para cambiarla en esa factura. Obligatoria en renglones de neto si el contrato no tiene cuenta.</w:t>
+            </w:r>
+          </w:p>
+        </w:tc>
+        <w:tc>
+          <w:tcPr>
+            <w:tcW w:w="2800" w:type="dxa"/>
+            <w:noWrap/>
+          </w:tcPr>
+          <w:p>
+            <w:pPr/>
+            <w:r>
+              <w:rPr>
+                <w:sz w:val="20"/>
+                <w:szCs w:val="20"/>
+              </w:rPr>
+              <w:t xml:space="preserve">crear-comprobante-proveedor / editar-comprobante-proveedor</w:t>
+            </w:r>
+          </w:p>
+        </w:tc>
+      </w:tr>
+      <w:tr>
+        <w:trPr/>
+        <w:tc>
+          <w:tcPr>
+            <w:tcW w:w="2800" w:type="dxa"/>
+            <w:noWrap/>
+          </w:tcPr>
+          <w:p>
+            <w:pPr/>
+            <w:r>
+              <w:rPr>
+                <w:sz w:val="20"/>
+                <w:szCs w:val="20"/>
+              </w:rPr>
+              <w:t xml:space="preserve">Badges del contrato</w:t>
+            </w:r>
+          </w:p>
+        </w:tc>
+        <w:tc>
+          <w:tcPr>
+            <w:tcW w:w="2800" w:type="dxa"/>
+            <w:noWrap/>
+          </w:tcPr>
+          <w:p>
+            <w:pPr/>
+            <w:r>
+              <w:rPr>
+                <w:sz w:val="20"/>
+                <w:szCs w:val="20"/>
+              </w:rPr>
+              <w:t xml:space="preserve">Bloque de la OC en la factura</w:t>
+            </w:r>
+          </w:p>
+        </w:tc>
+        <w:tc>
+          <w:tcPr>
+            <w:tcW w:w="2800" w:type="dxa"/>
+            <w:noWrap/>
+          </w:tcPr>
+          <w:p>
+            <w:pPr/>
+            <w:r>
+              <w:rPr>
+                <w:sz w:val="20"/>
+                <w:szCs w:val="20"/>
+              </w:rPr>
+              <w:t xml:space="preserve">Muestra si el contrato está vigente, si exige COM y de dónde sale la cuenta del neto.</w:t>
+            </w:r>
+          </w:p>
+        </w:tc>
+        <w:tc>
+          <w:tcPr>
+            <w:tcW w:w="2800" w:type="dxa"/>
+            <w:noWrap/>
+          </w:tcPr>
+          <w:p>
+            <w:pPr/>
+            <w:r>
+              <w:rPr>
+                <w:sz w:val="20"/>
+                <w:szCs w:val="20"/>
+              </w:rPr>
+              <w:t xml:space="preserve">crear-comprobante-proveedor / editar-comprobante-proveedor</w:t>
             </w:r>
           </w:p>
         </w:tc>
@@ -11161,7 +11258,7 @@
           <w:i w:val="1"/>
           <w:iCs w:val="1"/>
         </w:rPr>
-        <w:t xml:space="preserve">Tipos de aviso</w:t>
+        <w:t xml:space="preserve">Ruta de la factura según el contrato vigente</w:t>
       </w:r>
     </w:p>
     <w:tbl>
@@ -11206,7 +11303,7 @@
                 <w:b w:val="1"/>
                 <w:bCs w:val="1"/>
               </w:rPr>
-              <w:t xml:space="preserve">Aviso</w:t>
+              <w:t xml:space="preserve">Qué dice el contrato</w:t>
             </w:r>
           </w:p>
         </w:tc>
@@ -11226,7 +11323,7 @@
                 <w:b w:val="1"/>
                 <w:bCs w:val="1"/>
               </w:rPr>
-              <w:t xml:space="preserve">Cuándo se dispara</w:t>
+              <w:t xml:space="preserve">Modo de la factura</w:t>
             </w:r>
           </w:p>
         </w:tc>
@@ -11246,211 +11343,211 @@
                 <w:b w:val="1"/>
                 <w:bCs w:val="1"/>
               </w:rPr>
-              <w:t xml:space="preserve">Qué hay que hacer</w:t>
-            </w:r>
-          </w:p>
-        </w:tc>
-      </w:tr>
-      <w:tr>
-        <w:trPr/>
-        <w:tc>
-          <w:tcPr>
-            <w:tcW w:w="2800" w:type="dxa"/>
-            <w:noWrap/>
-          </w:tcPr>
-          <w:p>
-            <w:pPr/>
-            <w:r>
-              <w:rPr>
-                <w:sz w:val="20"/>
-                <w:szCs w:val="20"/>
-              </w:rPr>
-              <w:t xml:space="preserve">Por vencer</w:t>
-            </w:r>
-          </w:p>
-        </w:tc>
-        <w:tc>
-          <w:tcPr>
-            <w:tcW w:w="2800" w:type="dxa"/>
-            <w:noWrap/>
-          </w:tcPr>
-          <w:p>
-            <w:pPr/>
-            <w:r>
-              <w:rPr>
-                <w:sz w:val="20"/>
-                <w:szCs w:val="20"/>
-              </w:rPr>
-              <w:t xml:space="preserve">Cuando faltan tantos días para el fin de vigencia como indica el umbral (60, 30 y 15 días por defecto).</w:t>
-            </w:r>
-          </w:p>
-        </w:tc>
-        <w:tc>
-          <w:tcPr>
-            <w:tcW w:w="2800" w:type="dxa"/>
-            <w:noWrap/>
-          </w:tcPr>
-          <w:p>
-            <w:pPr/>
-            <w:r>
-              <w:rPr>
-                <w:sz w:val="20"/>
-                <w:szCs w:val="20"/>
-              </w:rPr>
-              <w:t xml:space="preserve">Renovar, renegociar o dejar vencer con decisión tomada.</w:t>
-            </w:r>
-          </w:p>
-        </w:tc>
-      </w:tr>
-      <w:tr>
-        <w:trPr/>
-        <w:tc>
-          <w:tcPr>
-            <w:tcW w:w="2800" w:type="dxa"/>
-            <w:noWrap/>
-          </w:tcPr>
-          <w:p>
-            <w:pPr/>
-            <w:r>
-              <w:rPr>
-                <w:sz w:val="20"/>
-                <w:szCs w:val="20"/>
-              </w:rPr>
-              <w:t xml:space="preserve">Preaviso de no renovación</w:t>
-            </w:r>
-          </w:p>
-        </w:tc>
-        <w:tc>
-          <w:tcPr>
-            <w:tcW w:w="2800" w:type="dxa"/>
-            <w:noWrap/>
-          </w:tcPr>
-          <w:p>
-            <w:pPr/>
-            <w:r>
-              <w:rPr>
-                <w:sz w:val="20"/>
-                <w:szCs w:val="20"/>
-              </w:rPr>
-              <w:t xml:space="preserve">Contratos con renovación automática, cuando se acerca la fecha límite para notificar la no renovación.</w:t>
-            </w:r>
-          </w:p>
-        </w:tc>
-        <w:tc>
-          <w:tcPr>
-            <w:tcW w:w="2800" w:type="dxa"/>
-            <w:noWrap/>
-          </w:tcPr>
-          <w:p>
-            <w:pPr/>
-            <w:r>
-              <w:rPr>
-                <w:sz w:val="20"/>
-                <w:szCs w:val="20"/>
-              </w:rPr>
-              <w:t xml:space="preserve">Notificar al proveedor antes de esa fecha si no se quiere continuar. Pasada la fecha, el contrato se renueva solo.</w:t>
-            </w:r>
-          </w:p>
-        </w:tc>
-      </w:tr>
-      <w:tr>
-        <w:trPr/>
-        <w:tc>
-          <w:tcPr>
-            <w:tcW w:w="2800" w:type="dxa"/>
-            <w:noWrap/>
-          </w:tcPr>
-          <w:p>
-            <w:pPr/>
-            <w:r>
-              <w:rPr>
-                <w:sz w:val="20"/>
-                <w:szCs w:val="20"/>
-              </w:rPr>
-              <w:t xml:space="preserve">Consumo del tope</w:t>
-            </w:r>
-          </w:p>
-        </w:tc>
-        <w:tc>
-          <w:tcPr>
-            <w:tcW w:w="2800" w:type="dxa"/>
-            <w:noWrap/>
-          </w:tcPr>
-          <w:p>
-            <w:pPr/>
-            <w:r>
-              <w:rPr>
-                <w:sz w:val="20"/>
-                <w:szCs w:val="20"/>
-              </w:rPr>
-              <w:t xml:space="preserve">Cuando el consumo alcanza el porcentaje configurado del monto contratado (80% y 100% por defecto).</w:t>
-            </w:r>
-          </w:p>
-        </w:tc>
-        <w:tc>
-          <w:tcPr>
-            <w:tcW w:w="2800" w:type="dxa"/>
-            <w:noWrap/>
-          </w:tcPr>
-          <w:p>
-            <w:pPr/>
-            <w:r>
-              <w:rPr>
-                <w:sz w:val="20"/>
-                <w:szCs w:val="20"/>
-              </w:rPr>
-              <w:t xml:space="preserve">Ampliar el monto contratado o emitir una OC nueva antes de seguir consumiendo.</w:t>
-            </w:r>
-          </w:p>
-        </w:tc>
-      </w:tr>
-      <w:tr>
-        <w:trPr/>
-        <w:tc>
-          <w:tcPr>
-            <w:tcW w:w="2800" w:type="dxa"/>
-            <w:noWrap/>
-          </w:tcPr>
-          <w:p>
-            <w:pPr/>
-            <w:r>
-              <w:rPr>
-                <w:sz w:val="20"/>
-                <w:szCs w:val="20"/>
-              </w:rPr>
-              <w:t xml:space="preserve">Vencido (escalamiento)</w:t>
-            </w:r>
-          </w:p>
-        </w:tc>
-        <w:tc>
-          <w:tcPr>
-            <w:tcW w:w="2800" w:type="dxa"/>
-            <w:noWrap/>
-          </w:tcPr>
-          <w:p>
-            <w:pPr/>
-            <w:r>
-              <w:rPr>
-                <w:sz w:val="20"/>
-                <w:szCs w:val="20"/>
-              </w:rPr>
-              <w:t xml:space="preserve">Vigencia terminada y el contrato sigue abierto. Se reitera cada 7 días.</w:t>
-            </w:r>
-          </w:p>
-        </w:tc>
-        <w:tc>
-          <w:tcPr>
-            <w:tcW w:w="2800" w:type="dxa"/>
-            <w:noWrap/>
-          </w:tcPr>
-          <w:p>
-            <w:pPr/>
-            <w:r>
-              <w:rPr>
-                <w:sz w:val="20"/>
-                <w:szCs w:val="20"/>
-              </w:rPr>
-              <w:t xml:space="preserve">Renovar, cerrar la OC o darla de baja. Es el aviso que no debería existir.</w:t>
+              <w:t xml:space="preserve">De dónde sale la cuenta del neto</w:t>
+            </w:r>
+          </w:p>
+        </w:tc>
+      </w:tr>
+      <w:tr>
+        <w:trPr/>
+        <w:tc>
+          <w:tcPr>
+            <w:tcW w:w="2800" w:type="dxa"/>
+            <w:noWrap/>
+          </w:tcPr>
+          <w:p>
+            <w:pPr/>
+            <w:r>
+              <w:rPr>
+                <w:sz w:val="20"/>
+                <w:szCs w:val="20"/>
+              </w:rPr>
+              <w:t xml:space="preserve">Recepción obligatoria</w:t>
+            </w:r>
+          </w:p>
+        </w:tc>
+        <w:tc>
+          <w:tcPr>
+            <w:tcW w:w="2800" w:type="dxa"/>
+            <w:noWrap/>
+          </w:tcPr>
+          <w:p>
+            <w:pPr/>
+            <w:r>
+              <w:rPr>
+                <w:sz w:val="20"/>
+                <w:szCs w:val="20"/>
+              </w:rPr>
+              <w:t xml:space="preserve">Factura contra recepción (COM). Sin COM no se puede grabar.</w:t>
+            </w:r>
+          </w:p>
+        </w:tc>
+        <w:tc>
+          <w:tcPr>
+            <w:tcW w:w="2800" w:type="dxa"/>
+            <w:noWrap/>
+          </w:tcPr>
+          <w:p>
+            <w:pPr/>
+            <w:r>
+              <w:rPr>
+                <w:sz w:val="20"/>
+                <w:szCs w:val="20"/>
+              </w:rPr>
+              <w:t xml:space="preserve">De las recepciones COM (provisión y cuentas de los artículos recibidos).</w:t>
+            </w:r>
+          </w:p>
+        </w:tc>
+      </w:tr>
+      <w:tr>
+        <w:trPr/>
+        <w:tc>
+          <w:tcPr>
+            <w:tcW w:w="2800" w:type="dxa"/>
+            <w:noWrap/>
+          </w:tcPr>
+          <w:p>
+            <w:pPr/>
+            <w:r>
+              <w:rPr>
+                <w:sz w:val="20"/>
+                <w:szCs w:val="20"/>
+              </w:rPr>
+              <w:t xml:space="preserve">Sin recepción + cuenta de los artículos de la OC</w:t>
+            </w:r>
+          </w:p>
+        </w:tc>
+        <w:tc>
+          <w:tcPr>
+            <w:tcW w:w="2800" w:type="dxa"/>
+            <w:noWrap/>
+          </w:tcPr>
+          <w:p>
+            <w:pPr/>
+            <w:r>
+              <w:rPr>
+                <w:sz w:val="20"/>
+                <w:szCs w:val="20"/>
+              </w:rPr>
+              <w:t xml:space="preserve">Gasto sin recepción. No se pide COM.</w:t>
+            </w:r>
+          </w:p>
+        </w:tc>
+        <w:tc>
+          <w:tcPr>
+            <w:tcW w:w="2800" w:type="dxa"/>
+            <w:noWrap/>
+          </w:tcPr>
+          <w:p>
+            <w:pPr/>
+            <w:r>
+              <w:rPr>
+                <w:sz w:val="20"/>
+                <w:szCs w:val="20"/>
+              </w:rPr>
+              <w:t xml:space="preserve">Cuentas de compras/gastos de los artículos de la OC, prorrateadas por importe.</w:t>
+            </w:r>
+          </w:p>
+        </w:tc>
+      </w:tr>
+      <w:tr>
+        <w:trPr/>
+        <w:tc>
+          <w:tcPr>
+            <w:tcW w:w="2800" w:type="dxa"/>
+            <w:noWrap/>
+          </w:tcPr>
+          <w:p>
+            <w:pPr/>
+            <w:r>
+              <w:rPr>
+                <w:sz w:val="20"/>
+                <w:szCs w:val="20"/>
+              </w:rPr>
+              <w:t xml:space="preserve">Sin recepción + cuenta indicada en el contrato</w:t>
+            </w:r>
+          </w:p>
+        </w:tc>
+        <w:tc>
+          <w:tcPr>
+            <w:tcW w:w="2800" w:type="dxa"/>
+            <w:noWrap/>
+          </w:tcPr>
+          <w:p>
+            <w:pPr/>
+            <w:r>
+              <w:rPr>
+                <w:sz w:val="20"/>
+                <w:szCs w:val="20"/>
+              </w:rPr>
+              <w:t xml:space="preserve">Gasto sin recepción. No se pide COM.</w:t>
+            </w:r>
+          </w:p>
+        </w:tc>
+        <w:tc>
+          <w:tcPr>
+            <w:tcW w:w="2800" w:type="dxa"/>
+            <w:noWrap/>
+          </w:tcPr>
+          <w:p>
+            <w:pPr/>
+            <w:r>
+              <w:rPr>
+                <w:sz w:val="20"/>
+                <w:szCs w:val="20"/>
+              </w:rPr>
+              <w:t xml:space="preserve">La cuenta cargada en el contrato (Cuenta a imputar). Queda precargada en cada factura; se puede cambiar en el renglón de neto.</w:t>
+            </w:r>
+          </w:p>
+        </w:tc>
+      </w:tr>
+      <w:tr>
+        <w:trPr/>
+        <w:tc>
+          <w:tcPr>
+            <w:tcW w:w="2800" w:type="dxa"/>
+            <w:noWrap/>
+          </w:tcPr>
+          <w:p>
+            <w:pPr/>
+            <w:r>
+              <w:rPr>
+                <w:sz w:val="20"/>
+                <w:szCs w:val="20"/>
+              </w:rPr>
+              <w:t xml:space="preserve">Contrato fuera de vigencia, o OC que no es contrato</w:t>
+            </w:r>
+          </w:p>
+        </w:tc>
+        <w:tc>
+          <w:tcPr>
+            <w:tcW w:w="2800" w:type="dxa"/>
+            <w:noWrap/>
+          </w:tcPr>
+          <w:p>
+            <w:pPr/>
+            <w:r>
+              <w:rPr>
+                <w:sz w:val="20"/>
+                <w:szCs w:val="20"/>
+              </w:rPr>
+              <w:t xml:space="preserve">Flujo estándar de la empresa (COM si hay recepciones, factura anticipada si la OC es anticipada, o gasto sin recepción).</w:t>
+            </w:r>
+          </w:p>
+        </w:tc>
+        <w:tc>
+          <w:tcPr>
+            <w:tcW w:w="2800" w:type="dxa"/>
+            <w:noWrap/>
+          </w:tcPr>
+          <w:p>
+            <w:pPr/>
+            <w:r>
+              <w:rPr>
+                <w:sz w:val="20"/>
+                <w:szCs w:val="20"/>
+              </w:rPr>
+              <w:t xml:space="preserve">Según ese flujo: COM, anticipo o cuenta del concepto de IVA compra.</w:t>
             </w:r>
           </w:p>
         </w:tc>
@@ -11463,9 +11560,1033 @@
       </w:pPr>
       <w:bookmarkStart w:id="13" w:name="_Toc13"/>
       <w:r>
-        <w:t>13. Circuito documental integrado</w:t>
+        <w:t>13. Avisos y seguimiento de contratos</w:t>
       </w:r>
       <w:bookmarkEnd w:id="13"/>
+    </w:p>
+    <w:p>
+      <w:pPr>
+        <w:jc w:val="center"/>
+      </w:pPr>
+      <w:r>
+        <w:pict>
+          <v:shape type="#_x0000_t75" stroked="f" style="width:450pt; height:281.25pt; margin-left:0pt; margin-top:0pt; mso-position-horizontal:left; mso-position-vertical:top; mso-position-horizontal-relative:char; mso-position-vertical-relative:line;">
+            <w10:wrap type="inline"/>
+            <v:imagedata r:id="rId17" o:title=""/>
+          </v:shape>
+        </w:pict>
+      </w:r>
+    </w:p>
+    <w:p>
+      <w:pPr>
+        <w:jc w:val="center"/>
+      </w:pPr>
+      <w:r>
+        <w:rPr>
+          <w:color w:val="666666"/>
+          <w:sz w:val="18"/>
+          <w:szCs w:val="18"/>
+          <w:i w:val="1"/>
+          <w:iCs w:val="1"/>
+        </w:rPr>
+        <w:t xml:space="preserve">Reporte de contratos y OC abiertas por vencer</w:t>
+      </w:r>
+    </w:p>
+    <w:p/>
+    <w:p>
+      <w:pPr>
+        <w:jc w:val="center"/>
+      </w:pPr>
+      <w:r>
+        <w:pict>
+          <v:shape type="#_x0000_t75" stroked="f" style="width:450pt; height:281.25pt; margin-left:0pt; margin-top:0pt; mso-position-horizontal:left; mso-position-vertical:top; mso-position-horizontal-relative:char; mso-position-vertical-relative:line;">
+            <w10:wrap type="inline"/>
+            <v:imagedata r:id="rId17" o:title=""/>
+          </v:shape>
+        </w:pict>
+      </w:r>
+    </w:p>
+    <w:p>
+      <w:pPr>
+        <w:jc w:val="center"/>
+      </w:pPr>
+      <w:r>
+        <w:rPr>
+          <w:color w:val="666666"/>
+          <w:sz w:val="18"/>
+          <w:szCs w:val="18"/>
+          <w:i w:val="1"/>
+          <w:iCs w:val="1"/>
+        </w:rPr>
+        <w:t xml:space="preserve">Reporte de contratos y OC abiertas por vencer</w:t>
+      </w:r>
+    </w:p>
+    <w:p/>
+    <w:p>
+      <w:pPr>
+        <w:jc w:val="both"/>
+        <w:spacing w:after="120"/>
+      </w:pPr>
+      <w:r>
+        <w:rPr>
+          <w:sz w:val="22"/>
+          <w:szCs w:val="22"/>
+        </w:rPr>
+        <w:t xml:space="preserve">Un proceso automático diario revisa todos los contratos y envía un mail cuando alguno cruza un umbral. Solo se vigilan las OC marcadas como contrato que están en estado APROBADA o CUMPLIDA: las suspendidas y cerradas quedan afuera porque ya no admiten movimiento.</w:t>
+      </w:r>
+    </w:p>
+    <w:p>
+      <w:pPr>
+        <w:jc w:val="both"/>
+        <w:spacing w:after="120"/>
+      </w:pPr>
+      <w:r>
+        <w:rPr>
+          <w:sz w:val="22"/>
+          <w:szCs w:val="22"/>
+        </w:rPr>
+        <w:t xml:space="preserve">Cada umbral avisa una sola vez. Si un contrato ya figuró en el aviso de 60 días, no vuelve a aparecer hasta el umbral de 30. Esto evita el mail diario repetido que termina en que nadie lo lee. La excepción es el escalamiento de contratos vencidos, que se reitera cada 7 días hasta que el contrato se resuelva.</w:t>
+      </w:r>
+    </w:p>
+    <w:p>
+      <w:pPr>
+        <w:jc w:val="both"/>
+        <w:spacing w:after="120"/>
+      </w:pPr>
+      <w:r>
+        <w:rPr>
+          <w:sz w:val="22"/>
+          <w:szCs w:val="22"/>
+        </w:rPr>
+        <w:t xml:space="preserve">Los destinatarios y el texto de los mails se configuran en Configuración → Avisos por módulo, en los eventos "Contratos / OC abiertas por vencer" (preventivo) y "Contratos / OC abiertas vencidas (escalamiento)". Son dos eventos separados para que el escalamiento pueda ir a jefatura o gerencia sin sumar a esas personas al aviso preventivo de todos los días.</w:t>
+      </w:r>
+    </w:p>
+    <w:p>
+      <w:pPr>
+        <w:jc w:val="both"/>
+        <w:spacing w:after="120"/>
+      </w:pPr>
+      <w:r>
+        <w:rPr>
+          <w:sz w:val="22"/>
+          <w:szCs w:val="22"/>
+        </w:rPr>
+        <w:t xml:space="preserve">Para trabajar la lista completa, sin depender del mail, está el reporte Compras → Reportes → Contratos y OC abiertas (compras/contrato-vencimiento-reporte). Permite filtrar por empresa, tipo de alerta, horizonte de días, proveedor y responsable, y exportar a PDF, Excel o CSV.</w:t>
+      </w:r>
+    </w:p>
+    <w:p>
+      <w:pPr>
+        <w:numPr>
+          <w:ilvl w:val="0"/>
+          <w:numId w:val=""/>
+        </w:numPr>
+      </w:pPr>
+      <w:r>
+        <w:rPr/>
+        <w:t xml:space="preserve">Filtro Tipo de alerta: Todos, Por vencer (dentro del horizonte), Con preaviso de no renovación pendiente, Consumo del tope en zona de alerta, Vencidos, o Sin fecha de vigencia cargada. Esta última opción sirve para detectar contratos mal cargados, que son los que nunca van a avisar.</w:t>
+      </w:r>
+    </w:p>
+    <w:p>
+      <w:pPr>
+        <w:numPr>
+          <w:ilvl w:val="0"/>
+          <w:numId w:val=""/>
+        </w:numPr>
+      </w:pPr>
+      <w:r>
+        <w:rPr/>
+        <w:t xml:space="preserve">Días de horizonte: cuántos días hacia adelante mirar (90 por defecto).</w:t>
+      </w:r>
+    </w:p>
+    <w:p>
+      <w:pPr>
+        <w:numPr>
+          <w:ilvl w:val="0"/>
+          <w:numId w:val=""/>
+        </w:numPr>
+      </w:pPr>
+      <w:r>
+        <w:rPr/>
+        <w:t xml:space="preserve">Solo sin responsable: contratos sin dueño asignado. Conviene revisarlo periódicamente porque son los que se pierden.</w:t>
+      </w:r>
+    </w:p>
+    <w:p>
+      <w:pPr>
+        <w:numPr>
+          <w:ilvl w:val="0"/>
+          <w:numId w:val=""/>
+        </w:numPr>
+      </w:pPr>
+      <w:r>
+        <w:rPr/>
+        <w:t xml:space="preserve">En la grilla, las filas de contratos vencidos se marcan en rojo y las que vencen dentro de 30 días en amarillo. La columna Situación explica el motivo concreto de la alerta.</w:t>
+      </w:r>
+    </w:p>
+    <w:p>
+      <w:pPr>
+        <w:numPr>
+          <w:ilvl w:val="0"/>
+          <w:numId w:val=""/>
+        </w:numPr>
+      </w:pPr>
+      <w:r>
+        <w:rPr/>
+        <w:t xml:space="preserve">Las columnas Recibido, Facturado y Consumido permiten auditar el consumo: si Recibido y Facturado difieren mucho, hay recepciones sin facturar o facturas sin recepción.</w:t>
+      </w:r>
+    </w:p>
+    <w:p>
+      <w:pPr>
+        <w:numPr>
+          <w:ilvl w:val="0"/>
+          <w:numId w:val=""/>
+        </w:numPr>
+      </w:pPr>
+      <w:r>
+        <w:rPr/>
+        <w:t xml:space="preserve">El número de OC es un enlace: abre la orden de compra en una pestaña nueva para revisar o renovar el contrato.</w:t>
+      </w:r>
+    </w:p>
+    <w:p/>
+    <w:p>
+      <w:pPr/>
+      <w:r>
+        <w:rPr>
+          <w:color w:val="2E75B6"/>
+          <w:sz w:val="22"/>
+          <w:szCs w:val="22"/>
+          <w:b w:val="1"/>
+          <w:bCs w:val="1"/>
+        </w:rPr>
+        <w:t xml:space="preserve">Reporte de contratos y OC abiertas por vencer</w:t>
+      </w:r>
+    </w:p>
+    <w:tbl>
+      <w:tblGrid>
+        <w:gridCol w:w="2800" w:type="dxa"/>
+        <w:gridCol w:w="2800" w:type="dxa"/>
+        <w:gridCol w:w="2800" w:type="dxa"/>
+        <w:gridCol w:w="2800" w:type="dxa"/>
+      </w:tblGrid>
+      <w:tblPr>
+        <w:tblW w:w="0" w:type="auto"/>
+        <w:tblLayout w:type="autofit"/>
+        <w:tblCellMar>
+          <w:top w:w="80" w:type="dxa"/>
+          <w:left w:w="80" w:type="dxa"/>
+          <w:right w:w="80" w:type="dxa"/>
+          <w:bottom w:w="80" w:type="dxa"/>
+        </w:tblCellMar>
+        <w:tblBorders>
+          <w:top w:val="single" w:sz="6" w:color="AAAAAA"/>
+          <w:left w:val="single" w:sz="6" w:color="AAAAAA"/>
+          <w:right w:val="single" w:sz="6" w:color="AAAAAA"/>
+          <w:bottom w:val="single" w:sz="6" w:color="AAAAAA"/>
+          <w:insideH w:val="single" w:sz="6" w:color="AAAAAA"/>
+          <w:insideV w:val="single" w:sz="6" w:color="AAAAAA"/>
+        </w:tblBorders>
+      </w:tblPr>
+      <w:tr>
+        <w:trPr/>
+        <w:tc>
+          <w:tcPr>
+            <w:tcW w:w="2800" w:type="dxa"/>
+            <w:shd w:val="clear" w:fill="2E75B6"/>
+            <w:noWrap/>
+          </w:tcPr>
+          <w:p>
+            <w:pPr/>
+            <w:r>
+              <w:rPr>
+                <w:color w:val="FFFFFF"/>
+                <w:sz w:val="20"/>
+                <w:szCs w:val="20"/>
+                <w:b w:val="1"/>
+                <w:bCs w:val="1"/>
+              </w:rPr>
+              <w:t xml:space="preserve">Herramienta</w:t>
+            </w:r>
+          </w:p>
+        </w:tc>
+        <w:tc>
+          <w:tcPr>
+            <w:tcW w:w="2800" w:type="dxa"/>
+            <w:shd w:val="clear" w:fill="2E75B6"/>
+            <w:noWrap/>
+          </w:tcPr>
+          <w:p>
+            <w:pPr/>
+            <w:r>
+              <w:rPr>
+                <w:color w:val="FFFFFF"/>
+                <w:sz w:val="20"/>
+                <w:szCs w:val="20"/>
+                <w:b w:val="1"/>
+                <w:bCs w:val="1"/>
+              </w:rPr>
+              <w:t xml:space="preserve">Ubicación</w:t>
+            </w:r>
+          </w:p>
+        </w:tc>
+        <w:tc>
+          <w:tcPr>
+            <w:tcW w:w="2800" w:type="dxa"/>
+            <w:shd w:val="clear" w:fill="2E75B6"/>
+            <w:noWrap/>
+          </w:tcPr>
+          <w:p>
+            <w:pPr/>
+            <w:r>
+              <w:rPr>
+                <w:color w:val="FFFFFF"/>
+                <w:sz w:val="20"/>
+                <w:szCs w:val="20"/>
+                <w:b w:val="1"/>
+                <w:bCs w:val="1"/>
+              </w:rPr>
+              <w:t xml:space="preserve">Qué hace</w:t>
+            </w:r>
+          </w:p>
+        </w:tc>
+        <w:tc>
+          <w:tcPr>
+            <w:tcW w:w="2800" w:type="dxa"/>
+            <w:shd w:val="clear" w:fill="2E75B6"/>
+            <w:noWrap/>
+          </w:tcPr>
+          <w:p>
+            <w:pPr/>
+            <w:r>
+              <w:rPr>
+                <w:color w:val="FFFFFF"/>
+                <w:sz w:val="20"/>
+                <w:szCs w:val="20"/>
+                <w:b w:val="1"/>
+                <w:bCs w:val="1"/>
+              </w:rPr>
+              <w:t xml:space="preserve">Permiso</w:t>
+            </w:r>
+          </w:p>
+        </w:tc>
+      </w:tr>
+      <w:tr>
+        <w:trPr/>
+        <w:tc>
+          <w:tcPr>
+            <w:tcW w:w="2800" w:type="dxa"/>
+            <w:noWrap/>
+          </w:tcPr>
+          <w:p>
+            <w:pPr/>
+            <w:r>
+              <w:rPr>
+                <w:sz w:val="20"/>
+                <w:szCs w:val="20"/>
+              </w:rPr>
+              <w:t xml:space="preserve">Consultar</w:t>
+            </w:r>
+          </w:p>
+        </w:tc>
+        <w:tc>
+          <w:tcPr>
+            <w:tcW w:w="2800" w:type="dxa"/>
+            <w:noWrap/>
+          </w:tcPr>
+          <w:p>
+            <w:pPr/>
+            <w:r>
+              <w:rPr>
+                <w:sz w:val="20"/>
+                <w:szCs w:val="20"/>
+              </w:rPr>
+              <w:t xml:space="preserve">Panel de filtros</w:t>
+            </w:r>
+          </w:p>
+        </w:tc>
+        <w:tc>
+          <w:tcPr>
+            <w:tcW w:w="2800" w:type="dxa"/>
+            <w:noWrap/>
+          </w:tcPr>
+          <w:p>
+            <w:pPr/>
+            <w:r>
+              <w:rPr>
+                <w:sz w:val="20"/>
+                <w:szCs w:val="20"/>
+              </w:rPr>
+              <w:t xml:space="preserve">Genera el listado según empresa, tipo de alerta, horizonte de días, proveedor y responsable.</w:t>
+            </w:r>
+          </w:p>
+        </w:tc>
+        <w:tc>
+          <w:tcPr>
+            <w:tcW w:w="2800" w:type="dxa"/>
+            <w:noWrap/>
+          </w:tcPr>
+          <w:p>
+            <w:pPr/>
+            <w:r>
+              <w:rPr>
+                <w:sz w:val="20"/>
+                <w:szCs w:val="20"/>
+              </w:rPr>
+              <w:t xml:space="preserve">listar-reporte-contrato-vencimiento</w:t>
+            </w:r>
+          </w:p>
+        </w:tc>
+      </w:tr>
+      <w:tr>
+        <w:trPr/>
+        <w:tc>
+          <w:tcPr>
+            <w:tcW w:w="2800" w:type="dxa"/>
+            <w:noWrap/>
+          </w:tcPr>
+          <w:p>
+            <w:pPr/>
+            <w:r>
+              <w:rPr>
+                <w:sz w:val="20"/>
+                <w:szCs w:val="20"/>
+              </w:rPr>
+              <w:t xml:space="preserve">Tipo de alerta</w:t>
+            </w:r>
+          </w:p>
+        </w:tc>
+        <w:tc>
+          <w:tcPr>
+            <w:tcW w:w="2800" w:type="dxa"/>
+            <w:noWrap/>
+          </w:tcPr>
+          <w:p>
+            <w:pPr/>
+            <w:r>
+              <w:rPr>
+                <w:sz w:val="20"/>
+                <w:szCs w:val="20"/>
+              </w:rPr>
+              <w:t xml:space="preserve">Panel de filtros</w:t>
+            </w:r>
+          </w:p>
+        </w:tc>
+        <w:tc>
+          <w:tcPr>
+            <w:tcW w:w="2800" w:type="dxa"/>
+            <w:noWrap/>
+          </w:tcPr>
+          <w:p>
+            <w:pPr/>
+            <w:r>
+              <w:rPr>
+                <w:sz w:val="20"/>
+                <w:szCs w:val="20"/>
+              </w:rPr>
+              <w:t xml:space="preserve">Por vencer, preaviso pendiente, consumo en zona de alerta, vencidos o sin vigencia cargada.</w:t>
+            </w:r>
+          </w:p>
+        </w:tc>
+        <w:tc>
+          <w:tcPr>
+            <w:tcW w:w="2800" w:type="dxa"/>
+            <w:noWrap/>
+          </w:tcPr>
+          <w:p>
+            <w:pPr/>
+            <w:r>
+              <w:rPr>
+                <w:sz w:val="20"/>
+                <w:szCs w:val="20"/>
+              </w:rPr>
+              <w:t xml:space="preserve">listar-reporte-contrato-vencimiento</w:t>
+            </w:r>
+          </w:p>
+        </w:tc>
+      </w:tr>
+      <w:tr>
+        <w:trPr/>
+        <w:tc>
+          <w:tcPr>
+            <w:tcW w:w="2800" w:type="dxa"/>
+            <w:noWrap/>
+          </w:tcPr>
+          <w:p>
+            <w:pPr/>
+            <w:r>
+              <w:rPr>
+                <w:sz w:val="20"/>
+                <w:szCs w:val="20"/>
+              </w:rPr>
+              <w:t xml:space="preserve">Solo sin responsable</w:t>
+            </w:r>
+          </w:p>
+        </w:tc>
+        <w:tc>
+          <w:tcPr>
+            <w:tcW w:w="2800" w:type="dxa"/>
+            <w:noWrap/>
+          </w:tcPr>
+          <w:p>
+            <w:pPr/>
+            <w:r>
+              <w:rPr>
+                <w:sz w:val="20"/>
+                <w:szCs w:val="20"/>
+              </w:rPr>
+              <w:t xml:space="preserve">Panel de filtros</w:t>
+            </w:r>
+          </w:p>
+        </w:tc>
+        <w:tc>
+          <w:tcPr>
+            <w:tcW w:w="2800" w:type="dxa"/>
+            <w:noWrap/>
+          </w:tcPr>
+          <w:p>
+            <w:pPr/>
+            <w:r>
+              <w:rPr>
+                <w:sz w:val="20"/>
+                <w:szCs w:val="20"/>
+              </w:rPr>
+              <w:t xml:space="preserve">Aísla los contratos sin dueño asignado, que son los que suelen quedar sin seguimiento.</w:t>
+            </w:r>
+          </w:p>
+        </w:tc>
+        <w:tc>
+          <w:tcPr>
+            <w:tcW w:w="2800" w:type="dxa"/>
+            <w:noWrap/>
+          </w:tcPr>
+          <w:p>
+            <w:pPr/>
+            <w:r>
+              <w:rPr>
+                <w:sz w:val="20"/>
+                <w:szCs w:val="20"/>
+              </w:rPr>
+              <w:t xml:space="preserve">listar-reporte-contrato-vencimiento</w:t>
+            </w:r>
+          </w:p>
+        </w:tc>
+      </w:tr>
+      <w:tr>
+        <w:trPr/>
+        <w:tc>
+          <w:tcPr>
+            <w:tcW w:w="2800" w:type="dxa"/>
+            <w:noWrap/>
+          </w:tcPr>
+          <w:p>
+            <w:pPr/>
+            <w:r>
+              <w:rPr>
+                <w:sz w:val="20"/>
+                <w:szCs w:val="20"/>
+              </w:rPr>
+              <w:t xml:space="preserve">PDF / Excel / CSV</w:t>
+            </w:r>
+          </w:p>
+        </w:tc>
+        <w:tc>
+          <w:tcPr>
+            <w:tcW w:w="2800" w:type="dxa"/>
+            <w:noWrap/>
+          </w:tcPr>
+          <w:p>
+            <w:pPr/>
+            <w:r>
+              <w:rPr>
+                <w:sz w:val="20"/>
+                <w:szCs w:val="20"/>
+              </w:rPr>
+              <w:t xml:space="preserve">Barra de botones grandes sobre la grilla (btn-app)</w:t>
+            </w:r>
+          </w:p>
+        </w:tc>
+        <w:tc>
+          <w:tcPr>
+            <w:tcW w:w="2800" w:type="dxa"/>
+            <w:noWrap/>
+          </w:tcPr>
+          <w:p>
+            <w:pPr/>
+            <w:r>
+              <w:rPr>
+                <w:sz w:val="20"/>
+                <w:szCs w:val="20"/>
+              </w:rPr>
+              <w:t xml:space="preserve">Exporta el resultado completo del filtro, no solo la página visible.</w:t>
+            </w:r>
+          </w:p>
+        </w:tc>
+        <w:tc>
+          <w:tcPr>
+            <w:tcW w:w="2800" w:type="dxa"/>
+            <w:noWrap/>
+          </w:tcPr>
+          <w:p>
+            <w:pPr/>
+            <w:r>
+              <w:rPr>
+                <w:sz w:val="20"/>
+                <w:szCs w:val="20"/>
+              </w:rPr>
+              <w:t xml:space="preserve">listar-reporte-contrato-vencimiento</w:t>
+            </w:r>
+          </w:p>
+        </w:tc>
+      </w:tr>
+      <w:tr>
+        <w:trPr/>
+        <w:tc>
+          <w:tcPr>
+            <w:tcW w:w="2800" w:type="dxa"/>
+            <w:noWrap/>
+          </w:tcPr>
+          <w:p>
+            <w:pPr/>
+            <w:r>
+              <w:rPr>
+                <w:sz w:val="20"/>
+                <w:szCs w:val="20"/>
+              </w:rPr>
+              <w:t xml:space="preserve">Número de OC (enlace)</w:t>
+            </w:r>
+          </w:p>
+        </w:tc>
+        <w:tc>
+          <w:tcPr>
+            <w:tcW w:w="2800" w:type="dxa"/>
+            <w:noWrap/>
+          </w:tcPr>
+          <w:p>
+            <w:pPr/>
+            <w:r>
+              <w:rPr>
+                <w:sz w:val="20"/>
+                <w:szCs w:val="20"/>
+              </w:rPr>
+              <w:t xml:space="preserve">Columna OC de la grilla</w:t>
+            </w:r>
+          </w:p>
+        </w:tc>
+        <w:tc>
+          <w:tcPr>
+            <w:tcW w:w="2800" w:type="dxa"/>
+            <w:noWrap/>
+          </w:tcPr>
+          <w:p>
+            <w:pPr/>
+            <w:r>
+              <w:rPr>
+                <w:sz w:val="20"/>
+                <w:szCs w:val="20"/>
+              </w:rPr>
+              <w:t xml:space="preserve">Abre la orden de compra en pestaña nueva para revisar o renovar el contrato.</w:t>
+            </w:r>
+          </w:p>
+        </w:tc>
+        <w:tc>
+          <w:tcPr>
+            <w:tcW w:w="2800" w:type="dxa"/>
+            <w:noWrap/>
+          </w:tcPr>
+          <w:p>
+            <w:pPr/>
+            <w:r>
+              <w:rPr>
+                <w:sz w:val="20"/>
+                <w:szCs w:val="20"/>
+              </w:rPr>
+              <w:t xml:space="preserve">editar-ordencompra o listar-ordencompra</w:t>
+            </w:r>
+          </w:p>
+        </w:tc>
+      </w:tr>
+      <w:tr>
+        <w:trPr/>
+        <w:tc>
+          <w:tcPr>
+            <w:tcW w:w="2800" w:type="dxa"/>
+            <w:noWrap/>
+          </w:tcPr>
+          <w:p>
+            <w:pPr/>
+            <w:r>
+              <w:rPr>
+                <w:sz w:val="20"/>
+                <w:szCs w:val="20"/>
+              </w:rPr>
+              <w:t xml:space="preserve">Resumen del filtro</w:t>
+            </w:r>
+          </w:p>
+        </w:tc>
+        <w:tc>
+          <w:tcPr>
+            <w:tcW w:w="2800" w:type="dxa"/>
+            <w:noWrap/>
+          </w:tcPr>
+          <w:p>
+            <w:pPr/>
+            <w:r>
+              <w:rPr>
+                <w:sz w:val="20"/>
+                <w:szCs w:val="20"/>
+              </w:rPr>
+              <w:t xml:space="preserve">Franja sobre la grilla</w:t>
+            </w:r>
+          </w:p>
+        </w:tc>
+        <w:tc>
+          <w:tcPr>
+            <w:tcW w:w="2800" w:type="dxa"/>
+            <w:noWrap/>
+          </w:tcPr>
+          <w:p>
+            <w:pPr/>
+            <w:r>
+              <w:rPr>
+                <w:sz w:val="20"/>
+                <w:szCs w:val="20"/>
+              </w:rPr>
+              <w:t xml:space="preserve">Totales de contratos, vencidos, por vencer, tope, recibido, facturado, consumido y disponible.</w:t>
+            </w:r>
+          </w:p>
+        </w:tc>
+        <w:tc>
+          <w:tcPr>
+            <w:tcW w:w="2800" w:type="dxa"/>
+            <w:noWrap/>
+          </w:tcPr>
+          <w:p>
+            <w:pPr/>
+            <w:r>
+              <w:rPr>
+                <w:sz w:val="20"/>
+                <w:szCs w:val="20"/>
+              </w:rPr>
+              <w:t xml:space="preserve">listar-reporte-contrato-vencimiento</w:t>
+            </w:r>
+          </w:p>
+        </w:tc>
+      </w:tr>
+    </w:tbl>
+    <w:p/>
+    <w:p>
+      <w:pPr/>
+      <w:r>
+        <w:rPr>
+          <w:color w:val="666666"/>
+          <w:sz w:val="18"/>
+          <w:szCs w:val="18"/>
+          <w:i w:val="1"/>
+          <w:iCs w:val="1"/>
+        </w:rPr>
+        <w:t xml:space="preserve">Tipos de aviso</w:t>
+      </w:r>
+    </w:p>
+    <w:tbl>
+      <w:tblGrid>
+        <w:gridCol w:w="2800" w:type="dxa"/>
+        <w:gridCol w:w="2800" w:type="dxa"/>
+        <w:gridCol w:w="2800" w:type="dxa"/>
+      </w:tblGrid>
+      <w:tblPr>
+        <w:tblW w:w="0" w:type="auto"/>
+        <w:tblLayout w:type="autofit"/>
+        <w:tblCellMar>
+          <w:top w:w="80" w:type="dxa"/>
+          <w:left w:w="80" w:type="dxa"/>
+          <w:right w:w="80" w:type="dxa"/>
+          <w:bottom w:w="80" w:type="dxa"/>
+        </w:tblCellMar>
+        <w:tblBorders>
+          <w:top w:val="single" w:sz="6" w:color="AAAAAA"/>
+          <w:left w:val="single" w:sz="6" w:color="AAAAAA"/>
+          <w:right w:val="single" w:sz="6" w:color="AAAAAA"/>
+          <w:bottom w:val="single" w:sz="6" w:color="AAAAAA"/>
+          <w:insideH w:val="single" w:sz="6" w:color="AAAAAA"/>
+          <w:insideV w:val="single" w:sz="6" w:color="AAAAAA"/>
+        </w:tblBorders>
+      </w:tblPr>
+      <w:tr>
+        <w:trPr/>
+        <w:tc>
+          <w:tcPr>
+            <w:tcW w:w="2800" w:type="dxa"/>
+            <w:shd w:val="clear" w:fill="2E75B6"/>
+            <w:noWrap/>
+          </w:tcPr>
+          <w:p>
+            <w:pPr/>
+            <w:r>
+              <w:rPr>
+                <w:color w:val="FFFFFF"/>
+                <w:sz w:val="20"/>
+                <w:szCs w:val="20"/>
+                <w:b w:val="1"/>
+                <w:bCs w:val="1"/>
+              </w:rPr>
+              <w:t xml:space="preserve">Aviso</w:t>
+            </w:r>
+          </w:p>
+        </w:tc>
+        <w:tc>
+          <w:tcPr>
+            <w:tcW w:w="2800" w:type="dxa"/>
+            <w:shd w:val="clear" w:fill="2E75B6"/>
+            <w:noWrap/>
+          </w:tcPr>
+          <w:p>
+            <w:pPr/>
+            <w:r>
+              <w:rPr>
+                <w:color w:val="FFFFFF"/>
+                <w:sz w:val="20"/>
+                <w:szCs w:val="20"/>
+                <w:b w:val="1"/>
+                <w:bCs w:val="1"/>
+              </w:rPr>
+              <w:t xml:space="preserve">Cuándo se dispara</w:t>
+            </w:r>
+          </w:p>
+        </w:tc>
+        <w:tc>
+          <w:tcPr>
+            <w:tcW w:w="2800" w:type="dxa"/>
+            <w:shd w:val="clear" w:fill="2E75B6"/>
+            <w:noWrap/>
+          </w:tcPr>
+          <w:p>
+            <w:pPr/>
+            <w:r>
+              <w:rPr>
+                <w:color w:val="FFFFFF"/>
+                <w:sz w:val="20"/>
+                <w:szCs w:val="20"/>
+                <w:b w:val="1"/>
+                <w:bCs w:val="1"/>
+              </w:rPr>
+              <w:t xml:space="preserve">Qué hay que hacer</w:t>
+            </w:r>
+          </w:p>
+        </w:tc>
+      </w:tr>
+      <w:tr>
+        <w:trPr/>
+        <w:tc>
+          <w:tcPr>
+            <w:tcW w:w="2800" w:type="dxa"/>
+            <w:noWrap/>
+          </w:tcPr>
+          <w:p>
+            <w:pPr/>
+            <w:r>
+              <w:rPr>
+                <w:sz w:val="20"/>
+                <w:szCs w:val="20"/>
+              </w:rPr>
+              <w:t xml:space="preserve">Por vencer</w:t>
+            </w:r>
+          </w:p>
+        </w:tc>
+        <w:tc>
+          <w:tcPr>
+            <w:tcW w:w="2800" w:type="dxa"/>
+            <w:noWrap/>
+          </w:tcPr>
+          <w:p>
+            <w:pPr/>
+            <w:r>
+              <w:rPr>
+                <w:sz w:val="20"/>
+                <w:szCs w:val="20"/>
+              </w:rPr>
+              <w:t xml:space="preserve">Cuando faltan tantos días para el fin de vigencia como indica el umbral (60, 30 y 15 días por defecto).</w:t>
+            </w:r>
+          </w:p>
+        </w:tc>
+        <w:tc>
+          <w:tcPr>
+            <w:tcW w:w="2800" w:type="dxa"/>
+            <w:noWrap/>
+          </w:tcPr>
+          <w:p>
+            <w:pPr/>
+            <w:r>
+              <w:rPr>
+                <w:sz w:val="20"/>
+                <w:szCs w:val="20"/>
+              </w:rPr>
+              <w:t xml:space="preserve">Renovar, renegociar o dejar vencer con decisión tomada.</w:t>
+            </w:r>
+          </w:p>
+        </w:tc>
+      </w:tr>
+      <w:tr>
+        <w:trPr/>
+        <w:tc>
+          <w:tcPr>
+            <w:tcW w:w="2800" w:type="dxa"/>
+            <w:noWrap/>
+          </w:tcPr>
+          <w:p>
+            <w:pPr/>
+            <w:r>
+              <w:rPr>
+                <w:sz w:val="20"/>
+                <w:szCs w:val="20"/>
+              </w:rPr>
+              <w:t xml:space="preserve">Preaviso de no renovación</w:t>
+            </w:r>
+          </w:p>
+        </w:tc>
+        <w:tc>
+          <w:tcPr>
+            <w:tcW w:w="2800" w:type="dxa"/>
+            <w:noWrap/>
+          </w:tcPr>
+          <w:p>
+            <w:pPr/>
+            <w:r>
+              <w:rPr>
+                <w:sz w:val="20"/>
+                <w:szCs w:val="20"/>
+              </w:rPr>
+              <w:t xml:space="preserve">Contratos con renovación automática, cuando se acerca la fecha límite para notificar la no renovación.</w:t>
+            </w:r>
+          </w:p>
+        </w:tc>
+        <w:tc>
+          <w:tcPr>
+            <w:tcW w:w="2800" w:type="dxa"/>
+            <w:noWrap/>
+          </w:tcPr>
+          <w:p>
+            <w:pPr/>
+            <w:r>
+              <w:rPr>
+                <w:sz w:val="20"/>
+                <w:szCs w:val="20"/>
+              </w:rPr>
+              <w:t xml:space="preserve">Notificar al proveedor antes de esa fecha si no se quiere continuar. Pasada la fecha, el contrato se renueva solo.</w:t>
+            </w:r>
+          </w:p>
+        </w:tc>
+      </w:tr>
+      <w:tr>
+        <w:trPr/>
+        <w:tc>
+          <w:tcPr>
+            <w:tcW w:w="2800" w:type="dxa"/>
+            <w:noWrap/>
+          </w:tcPr>
+          <w:p>
+            <w:pPr/>
+            <w:r>
+              <w:rPr>
+                <w:sz w:val="20"/>
+                <w:szCs w:val="20"/>
+              </w:rPr>
+              <w:t xml:space="preserve">Consumo del tope</w:t>
+            </w:r>
+          </w:p>
+        </w:tc>
+        <w:tc>
+          <w:tcPr>
+            <w:tcW w:w="2800" w:type="dxa"/>
+            <w:noWrap/>
+          </w:tcPr>
+          <w:p>
+            <w:pPr/>
+            <w:r>
+              <w:rPr>
+                <w:sz w:val="20"/>
+                <w:szCs w:val="20"/>
+              </w:rPr>
+              <w:t xml:space="preserve">Cuando el consumo alcanza el porcentaje configurado del monto contratado (80% y 100% por defecto).</w:t>
+            </w:r>
+          </w:p>
+        </w:tc>
+        <w:tc>
+          <w:tcPr>
+            <w:tcW w:w="2800" w:type="dxa"/>
+            <w:noWrap/>
+          </w:tcPr>
+          <w:p>
+            <w:pPr/>
+            <w:r>
+              <w:rPr>
+                <w:sz w:val="20"/>
+                <w:szCs w:val="20"/>
+              </w:rPr>
+              <w:t xml:space="preserve">Ampliar el monto contratado o emitir una OC nueva antes de seguir consumiendo.</w:t>
+            </w:r>
+          </w:p>
+        </w:tc>
+      </w:tr>
+      <w:tr>
+        <w:trPr/>
+        <w:tc>
+          <w:tcPr>
+            <w:tcW w:w="2800" w:type="dxa"/>
+            <w:noWrap/>
+          </w:tcPr>
+          <w:p>
+            <w:pPr/>
+            <w:r>
+              <w:rPr>
+                <w:sz w:val="20"/>
+                <w:szCs w:val="20"/>
+              </w:rPr>
+              <w:t xml:space="preserve">Vencido (escalamiento)</w:t>
+            </w:r>
+          </w:p>
+        </w:tc>
+        <w:tc>
+          <w:tcPr>
+            <w:tcW w:w="2800" w:type="dxa"/>
+            <w:noWrap/>
+          </w:tcPr>
+          <w:p>
+            <w:pPr/>
+            <w:r>
+              <w:rPr>
+                <w:sz w:val="20"/>
+                <w:szCs w:val="20"/>
+              </w:rPr>
+              <w:t xml:space="preserve">Vigencia terminada y el contrato sigue abierto. Se reitera cada 7 días.</w:t>
+            </w:r>
+          </w:p>
+        </w:tc>
+        <w:tc>
+          <w:tcPr>
+            <w:tcW w:w="2800" w:type="dxa"/>
+            <w:noWrap/>
+          </w:tcPr>
+          <w:p>
+            <w:pPr/>
+            <w:r>
+              <w:rPr>
+                <w:sz w:val="20"/>
+                <w:szCs w:val="20"/>
+              </w:rPr>
+              <w:t xml:space="preserve">Renovar, cerrar la OC o darla de baja. Es el aviso que no debería existir.</w:t>
+            </w:r>
+          </w:p>
+        </w:tc>
+      </w:tr>
+    </w:tbl>
+    <w:p/>
+    <w:p>
+      <w:pPr>
+        <w:pStyle w:val="Heading2"/>
+      </w:pPr>
+      <w:bookmarkStart w:id="14" w:name="_Toc14"/>
+      <w:r>
+        <w:t>14. Circuito documental integrado</w:t>
+      </w:r>
+      <w:bookmarkEnd w:id="14"/>
     </w:p>
     <w:p>
       <w:pPr>
@@ -11532,18 +12653,18 @@
           <w:sz w:val="22"/>
           <w:szCs w:val="22"/>
         </w:rPr>
-        <w:t xml:space="preserve">Las OC marcadas como contrato no siguen ese cierre: quedan vigentes durante todo el período contratado y se van consumiendo con recepciones y facturas sucesivas, hasta que se renuevan o se cierran (ver capítulos 11 y 12).</w:t>
+        <w:t xml:space="preserve">Las OC marcadas como contrato no siguen ese cierre: quedan vigentes durante todo el período contratado y se van consumiendo con recepciones y facturas sucesivas, hasta que se renuevan o se cierran (ver capítulos 11, 12 y 13). La ruta de cada factura (con o sin COM, y de dónde sale la cuenta del neto) la fija el contrato, no el flujo general de la empresa.</w:t>
       </w:r>
     </w:p>
     <w:p>
       <w:pPr>
         <w:pStyle w:val="Heading2"/>
       </w:pPr>
-      <w:bookmarkStart w:id="14" w:name="_Toc14"/>
-      <w:r>
-        <w:t>14. Integración con sistema Anita</w:t>
-      </w:r>
-      <w:bookmarkEnd w:id="14"/>
+      <w:bookmarkStart w:id="15" w:name="_Toc15"/>
+      <w:r>
+        <w:t>15. Integración con sistema Anita</w:t>
+      </w:r>
+      <w:bookmarkEnd w:id="15"/>
     </w:p>
     <w:p>
       <w:pPr>
@@ -11611,11 +12732,11 @@
       <w:pPr>
         <w:pStyle w:val="Heading2"/>
       </w:pPr>
-      <w:bookmarkStart w:id="15" w:name="_Toc15"/>
-      <w:r>
-        <w:t>15. Resolución de problemas frecuentes</w:t>
-      </w:r>
-      <w:bookmarkEnd w:id="15"/>
+      <w:bookmarkStart w:id="16" w:name="_Toc16"/>
+      <w:r>
+        <w:t>16. Resolución de problemas frecuentes</w:t>
+      </w:r>
+      <w:bookmarkEnd w:id="16"/>
     </w:p>
     <w:p>
       <w:pPr>
@@ -11725,16 +12846,76 @@
         <w:t xml:space="preserve">El consumo quedó en cero con recepciones cargadas: revise que las líneas de la recepción tengan precio. Si la OC no tenía precio, la recepción se valoriza en cero y el consumo recién aparece cuando llega la factura.</w:t>
       </w:r>
     </w:p>
+    <w:p>
+      <w:pPr>
+        <w:numPr>
+          <w:ilvl w:val="0"/>
+          <w:numId w:val=""/>
+        </w:numPr>
+      </w:pPr>
+      <w:r>
+        <w:rPr/>
+        <w:t xml:space="preserve">No puedo cargar la factura de un abono / honorario: el contrato vigente probablemente tiene "Recepción para facturar" en Obligatoria. Edite la OC, márquela en "No requiere recepción" y elija de dónde sale la cuenta (artículos de la OC o cuenta del contrato).</w:t>
+      </w:r>
+    </w:p>
+    <w:p>
+      <w:pPr>
+        <w:numPr>
+          <w:ilvl w:val="0"/>
+          <w:numId w:val=""/>
+        </w:numPr>
+      </w:pPr>
+      <w:r>
+        <w:rPr/>
+        <w:t xml:space="preserve">La factura pide COM aunque el contrato es un servicio: misma causa: recepción obligatoria en el contrato, o el contrato no está vigente a la fecha del comprobante (en ese caso rige el flujo de la empresa).</w:t>
+      </w:r>
+    </w:p>
+    <w:p>
+      <w:pPr>
+        <w:numPr>
+          <w:ilvl w:val="0"/>
+          <w:numId w:val=""/>
+        </w:numPr>
+      </w:pPr>
+      <w:r>
+        <w:rPr/>
+        <w:t xml:space="preserve">Al grabar pide la cuenta del contrato: el contrato está en sin recepción con cuenta indicada en el contrato, pero esa cuenta no está cargada. Edite la OC, elija "Cuenta indicada en este contrato" y complete Cuenta a imputar.</w:t>
+      </w:r>
+    </w:p>
+    <w:p>
+      <w:pPr>
+        <w:numPr>
+          <w:ilvl w:val="0"/>
+          <w:numId w:val=""/>
+        </w:numPr>
+      </w:pPr>
+      <w:r>
+        <w:rPr/>
+        <w:t xml:space="preserve">Al grabar pide la cuenta DEBE del neto: complete la columna Cuenta DEBE en los renglones de neto, o cargue la cuenta en el contrato para que se precargue sola.</w:t>
+      </w:r>
+    </w:p>
+    <w:p>
+      <w:pPr>
+        <w:numPr>
+          <w:ilvl w:val="0"/>
+          <w:numId w:val=""/>
+        </w:numPr>
+      </w:pPr>
+      <w:r>
+        <w:rPr/>
+        <w:t xml:space="preserve">Al contabilizar falta la cuenta de un artículo de la OC: el contrato imputa el neto con las cuentas de los ítems. Abra el artículo y cargue la cuenta de compras o gastos de la empresa, o cambie la imputación del contrato a cuenta indicada en el contrato.</w:t>
+      </w:r>
+    </w:p>
     <w:p/>
     <w:p>
       <w:pPr>
         <w:pStyle w:val="Heading2"/>
       </w:pPr>
-      <w:bookmarkStart w:id="16" w:name="_Toc16"/>
-      <w:r>
-        <w:t>16. Soporte</w:t>
-      </w:r>
-      <w:bookmarkEnd w:id="16"/>
+      <w:bookmarkStart w:id="17" w:name="_Toc17"/>
+      <w:r>
+        <w:t>17. Soporte</w:t>
+      </w:r>
+      <w:bookmarkEnd w:id="17"/>
     </w:p>
     <w:p>
       <w:pPr>

</xml_diff>